<commit_message>
docs: update SRS to v1.1 with revision history and traceability status
</commit_message>
<xml_diff>
--- a/docs/SRS_Pustaka_Pangan.docx
+++ b/docs/SRS_Pustaka_Pangan.docx
@@ -60,16 +60,272 @@
         <w:rPr>
           <w:rtl w:val="0"/>
         </w:rPr>
-        <w:t xml:space="preserve"> 1.0</w:t>
-      </w:r>
-    </w:p>
+        <w:t xml:space="preserve"> 1.1</w:t>
+      </w:r>
+    </w:p>
+    <w:p>
+      <w:pPr>
+        <w:pStyle w:val="Heading2"/>
+        <w:rPr/>
+      </w:pPr>
+      <w:bookmarkStart w:colFirst="0" w:colLast="0" w:name="_mmiyov2sat2u" w:id="1"/>
+      <w:bookmarkEnd w:id="1"/>
+      <w:r>
+        <w:rPr>
+          <w:rtl w:val="0"/>
+        </w:rPr>
+        <w:t xml:space="preserve">Revision History</w:t>
+      </w:r>
+    </w:p>
+    <w:p>
+      <w:pPr>
+        <w:widowControl w:val="0"/>
+        <w:spacing w:line="276" w:lineRule="auto"/>
+        <w:rPr/>
+      </w:pPr>
+      <w:r>
+        <w:rPr>
+          <w:rtl w:val="0"/>
+        </w:rPr>
+      </w:r>
+    </w:p>
+    <w:tbl>
+      <w:tblPr>
+        <w:tblStyle w:val="Table1"/>
+        <w:tblW w:w="8940.0" w:type="dxa"/>
+        <w:jc w:val="left"/>
+        <w:tblBorders>
+          <w:top w:color="bdc3c7" w:space="0" w:sz="8" w:val="single"/>
+          <w:left w:color="000000" w:space="0" w:sz="0" w:val="nil"/>
+          <w:bottom w:color="bdc3c7" w:space="0" w:sz="8" w:val="single"/>
+          <w:right w:color="000000" w:space="0" w:sz="0" w:val="nil"/>
+          <w:insideH w:color="ecf0f1" w:space="0" w:sz="8" w:val="single"/>
+          <w:insideV w:color="ecf0f1" w:space="0" w:sz="8" w:val="single"/>
+        </w:tblBorders>
+        <w:tblLayout w:type="fixed"/>
+        <w:tblLook w:val="0620"/>
+      </w:tblPr>
+      <w:tblGrid>
+        <w:gridCol w:w="1080"/>
+        <w:gridCol w:w="1920"/>
+        <w:gridCol w:w="4575"/>
+        <w:gridCol w:w="1365"/>
+        <w:tblGridChange w:id="0">
+          <w:tblGrid>
+            <w:gridCol w:w="1080"/>
+            <w:gridCol w:w="1920"/>
+            <w:gridCol w:w="4575"/>
+            <w:gridCol w:w="1365"/>
+          </w:tblGrid>
+        </w:tblGridChange>
+      </w:tblGrid>
+      <w:tr>
+        <w:trPr>
+          <w:cantSplit w:val="0"/>
+          <w:tblHeader w:val="1"/>
+        </w:trPr>
+        <w:tc>
+          <w:tcPr/>
+          <w:p>
+            <w:pPr>
+              <w:rPr/>
+            </w:pPr>
+            <w:r>
+              <w:rPr>
+                <w:rtl w:val="0"/>
+              </w:rPr>
+              <w:t xml:space="preserve">Versi</w:t>
+            </w:r>
+          </w:p>
+        </w:tc>
+        <w:tc>
+          <w:tcPr/>
+          <w:p>
+            <w:pPr>
+              <w:rPr/>
+            </w:pPr>
+            <w:r>
+              <w:rPr>
+                <w:rtl w:val="0"/>
+              </w:rPr>
+              <w:t xml:space="preserve">Tanggal</w:t>
+            </w:r>
+          </w:p>
+        </w:tc>
+        <w:tc>
+          <w:tcPr/>
+          <w:p>
+            <w:pPr>
+              <w:rPr/>
+            </w:pPr>
+            <w:r>
+              <w:rPr>
+                <w:rtl w:val="0"/>
+              </w:rPr>
+              <w:t xml:space="preserve">Perubahan</w:t>
+            </w:r>
+          </w:p>
+        </w:tc>
+        <w:tc>
+          <w:tcPr/>
+          <w:p>
+            <w:pPr>
+              <w:rPr/>
+            </w:pPr>
+            <w:r>
+              <w:rPr>
+                <w:rtl w:val="0"/>
+              </w:rPr>
+              <w:t xml:space="preserve">Penulis</w:t>
+            </w:r>
+          </w:p>
+        </w:tc>
+      </w:tr>
+      <w:tr>
+        <w:trPr>
+          <w:cantSplit w:val="0"/>
+          <w:tblHeader w:val="0"/>
+        </w:trPr>
+        <w:tc>
+          <w:tcPr/>
+          <w:p>
+            <w:pPr>
+              <w:rPr/>
+            </w:pPr>
+            <w:r>
+              <w:rPr>
+                <w:rtl w:val="0"/>
+              </w:rPr>
+              <w:t xml:space="preserve">1.0</w:t>
+            </w:r>
+          </w:p>
+        </w:tc>
+        <w:tc>
+          <w:tcPr/>
+          <w:p>
+            <w:pPr>
+              <w:rPr/>
+            </w:pPr>
+            <w:r>
+              <w:rPr>
+                <w:rtl w:val="0"/>
+              </w:rPr>
+              <w:t xml:space="preserve">03/08/2026</w:t>
+            </w:r>
+          </w:p>
+        </w:tc>
+        <w:tc>
+          <w:tcPr/>
+          <w:p>
+            <w:pPr>
+              <w:rPr/>
+            </w:pPr>
+            <w:r>
+              <w:rPr>
+                <w:rtl w:val="0"/>
+              </w:rPr>
+              <w:t xml:space="preserve">Draft awal SRS</w:t>
+            </w:r>
+          </w:p>
+        </w:tc>
+        <w:tc>
+          <w:tcPr/>
+          <w:p>
+            <w:pPr>
+              <w:rPr/>
+            </w:pPr>
+            <w:r>
+              <w:rPr>
+                <w:rtl w:val="0"/>
+              </w:rPr>
+              <w:t xml:space="preserve">Tifa</w:t>
+            </w:r>
+          </w:p>
+        </w:tc>
+      </w:tr>
+      <w:tr>
+        <w:trPr>
+          <w:cantSplit w:val="0"/>
+          <w:tblHeader w:val="0"/>
+        </w:trPr>
+        <w:tc>
+          <w:tcPr/>
+          <w:p>
+            <w:pPr>
+              <w:rPr/>
+            </w:pPr>
+            <w:r>
+              <w:rPr>
+                <w:rtl w:val="0"/>
+              </w:rPr>
+              <w:t xml:space="preserve">1.1</w:t>
+            </w:r>
+          </w:p>
+        </w:tc>
+        <w:tc>
+          <w:tcPr/>
+          <w:p>
+            <w:pPr>
+              <w:rPr/>
+            </w:pPr>
+            <w:r>
+              <w:rPr>
+                <w:rtl w:val="0"/>
+              </w:rPr>
+              <w:t xml:space="preserve">23/09/2026</w:t>
+            </w:r>
+          </w:p>
+        </w:tc>
+        <w:tc>
+          <w:tcPr/>
+          <w:p>
+            <w:pPr>
+              <w:rPr/>
+            </w:pPr>
+            <w:r>
+              <w:rPr>
+                <w:rtl w:val="0"/>
+              </w:rPr>
+              <w:t xml:space="preserve">Updata Requirements Traceability Matrix (Bagian 6) berdasarkan hasil regression testing tanggal 21/09/2026. Menambahkan catatan gap implementasi: fitur pencarian, kategori Populer/Gratis, pemotongan saldo otomatis. pembelian paket langganan, dan unduhan file PDF sungguhan belum diimplementasikan.</w:t>
+            </w:r>
+          </w:p>
+        </w:tc>
+        <w:tc>
+          <w:tcPr/>
+          <w:p>
+            <w:pPr>
+              <w:rPr/>
+            </w:pPr>
+            <w:r>
+              <w:rPr>
+                <w:rtl w:val="0"/>
+              </w:rPr>
+              <w:t xml:space="preserve">Tifa</w:t>
+            </w:r>
+          </w:p>
+        </w:tc>
+      </w:tr>
+    </w:tbl>
     <w:p>
       <w:pPr>
         <w:pStyle w:val="Heading1"/>
         <w:rPr/>
       </w:pPr>
-      <w:bookmarkStart w:colFirst="0" w:colLast="0" w:name="_rsge37298wjg" w:id="1"/>
-      <w:bookmarkEnd w:id="1"/>
+      <w:bookmarkStart w:colFirst="0" w:colLast="0" w:name="_ivg4yeiywmw7" w:id="2"/>
+      <w:bookmarkEnd w:id="2"/>
+      <w:r>
+        <w:rPr>
+          <w:rtl w:val="0"/>
+        </w:rPr>
+      </w:r>
+    </w:p>
+    <w:p>
+      <w:pPr>
+        <w:pStyle w:val="Heading1"/>
+        <w:rPr/>
+      </w:pPr>
+      <w:bookmarkStart w:colFirst="0" w:colLast="0" w:name="_rsge37298wjg" w:id="3"/>
+      <w:bookmarkEnd w:id="3"/>
       <w:r>
         <w:rPr>
           <w:rtl w:val="0"/>
@@ -82,8 +338,8 @@
         <w:pStyle w:val="Heading2"/>
         <w:rPr/>
       </w:pPr>
-      <w:bookmarkStart w:colFirst="0" w:colLast="0" w:name="_c4qk5bmzfwcp" w:id="2"/>
-      <w:bookmarkEnd w:id="2"/>
+      <w:bookmarkStart w:colFirst="0" w:colLast="0" w:name="_c4qk5bmzfwcp" w:id="4"/>
+      <w:bookmarkEnd w:id="4"/>
       <w:r>
         <w:rPr>
           <w:rtl w:val="0"/>
@@ -108,8 +364,8 @@
         <w:pStyle w:val="Heading2"/>
         <w:rPr/>
       </w:pPr>
-      <w:bookmarkStart w:colFirst="0" w:colLast="0" w:name="_4vimkb8f2hq5" w:id="3"/>
-      <w:bookmarkEnd w:id="3"/>
+      <w:bookmarkStart w:colFirst="0" w:colLast="0" w:name="_4vimkb8f2hq5" w:id="5"/>
+      <w:bookmarkEnd w:id="5"/>
       <w:r>
         <w:rPr>
           <w:rtl w:val="0"/>
@@ -218,8 +474,8 @@
         <w:pStyle w:val="Heading2"/>
         <w:rPr/>
       </w:pPr>
-      <w:bookmarkStart w:colFirst="0" w:colLast="0" w:name="_bks5viubu6wa" w:id="4"/>
-      <w:bookmarkEnd w:id="4"/>
+      <w:bookmarkStart w:colFirst="0" w:colLast="0" w:name="_bks5viubu6wa" w:id="6"/>
+      <w:bookmarkEnd w:id="6"/>
       <w:r>
         <w:rPr>
           <w:rtl w:val="0"/>
@@ -374,8 +630,8 @@
         <w:pStyle w:val="Heading2"/>
         <w:rPr/>
       </w:pPr>
-      <w:bookmarkStart w:colFirst="0" w:colLast="0" w:name="_kso96fcb7dsi" w:id="5"/>
-      <w:bookmarkEnd w:id="5"/>
+      <w:bookmarkStart w:colFirst="0" w:colLast="0" w:name="_kso96fcb7dsi" w:id="7"/>
+      <w:bookmarkEnd w:id="7"/>
       <w:r>
         <w:rPr>
           <w:rtl w:val="0"/>
@@ -418,8 +674,8 @@
         <w:pStyle w:val="Heading1"/>
         <w:rPr/>
       </w:pPr>
-      <w:bookmarkStart w:colFirst="0" w:colLast="0" w:name="_dnitpenottcc" w:id="6"/>
-      <w:bookmarkEnd w:id="6"/>
+      <w:bookmarkStart w:colFirst="0" w:colLast="0" w:name="_dnitpenottcc" w:id="8"/>
+      <w:bookmarkEnd w:id="8"/>
       <w:r>
         <w:rPr>
           <w:rtl w:val="0"/>
@@ -432,8 +688,8 @@
         <w:pStyle w:val="Heading2"/>
         <w:rPr/>
       </w:pPr>
-      <w:bookmarkStart w:colFirst="0" w:colLast="0" w:name="_hrzyuyin32si" w:id="7"/>
-      <w:bookmarkEnd w:id="7"/>
+      <w:bookmarkStart w:colFirst="0" w:colLast="0" w:name="_hrzyuyin32si" w:id="9"/>
+      <w:bookmarkEnd w:id="9"/>
       <w:r>
         <w:rPr>
           <w:rtl w:val="0"/>
@@ -492,7 +748,7 @@
         <w:rPr>
           <w:rtl w:val="0"/>
         </w:rPr>
-        <w:t xml:space="preserve">web Pustaka Pangan yang sudah ada. Aplikasi ini akan berkomunikasi dengan server melalui REST API yang disediakan oleh Tim IT untuk mengakses basis data pengguna, transaksi, dan konten majalah.</w:t>
+        <w:t xml:space="preserve">web Pustaka Pangan yang sudah ada. Aplikasi ini akan berkomunikasi dengan server melalui REST API untuk mengakses basis data pengguna, transaksi, dan konten majalah.</w:t>
       </w:r>
     </w:p>
     <w:p>
@@ -500,8 +756,8 @@
         <w:pStyle w:val="Heading2"/>
         <w:rPr/>
       </w:pPr>
-      <w:bookmarkStart w:colFirst="0" w:colLast="0" w:name="_16z6ty2azaa9" w:id="8"/>
-      <w:bookmarkEnd w:id="8"/>
+      <w:bookmarkStart w:colFirst="0" w:colLast="0" w:name="_16z6ty2azaa9" w:id="10"/>
+      <w:bookmarkEnd w:id="10"/>
       <w:r>
         <w:rPr>
           <w:rtl w:val="0"/>
@@ -568,8 +824,8 @@
         <w:pStyle w:val="Heading2"/>
         <w:rPr/>
       </w:pPr>
-      <w:bookmarkStart w:colFirst="0" w:colLast="0" w:name="_kkiqhn7v0pwa" w:id="9"/>
-      <w:bookmarkEnd w:id="9"/>
+      <w:bookmarkStart w:colFirst="0" w:colLast="0" w:name="_kkiqhn7v0pwa" w:id="11"/>
+      <w:bookmarkEnd w:id="11"/>
       <w:r>
         <w:rPr>
           <w:rtl w:val="0"/>
@@ -622,8 +878,8 @@
         <w:pStyle w:val="Heading2"/>
         <w:rPr/>
       </w:pPr>
-      <w:bookmarkStart w:colFirst="0" w:colLast="0" w:name="_4ehy7ipax4ys" w:id="10"/>
-      <w:bookmarkEnd w:id="10"/>
+      <w:bookmarkStart w:colFirst="0" w:colLast="0" w:name="_4ehy7ipax4ys" w:id="12"/>
+      <w:bookmarkEnd w:id="12"/>
       <w:r>
         <w:rPr>
           <w:rtl w:val="0"/>
@@ -672,8 +928,8 @@
         <w:pStyle w:val="Heading1"/>
         <w:rPr/>
       </w:pPr>
-      <w:bookmarkStart w:colFirst="0" w:colLast="0" w:name="_7saczgewcldv" w:id="11"/>
-      <w:bookmarkEnd w:id="11"/>
+      <w:bookmarkStart w:colFirst="0" w:colLast="0" w:name="_7saczgewcldv" w:id="13"/>
+      <w:bookmarkEnd w:id="13"/>
       <w:r>
         <w:rPr>
           <w:rtl w:val="0"/>
@@ -708,8 +964,8 @@
     </w:p>
     <w:tbl>
       <w:tblPr>
-        <w:tblStyle w:val="Table1"/>
-        <w:tblW w:w="9029.0" w:type="dxa"/>
+        <w:tblStyle w:val="Table2"/>
+        <w:tblW w:w="9000.0" w:type="dxa"/>
         <w:jc w:val="left"/>
         <w:tblBorders>
           <w:top w:color="bdc3c7" w:space="0" w:sz="8" w:val="single"/>
@@ -723,14 +979,14 @@
         <w:tblLook w:val="0620"/>
       </w:tblPr>
       <w:tblGrid>
-        <w:gridCol w:w="3009.6666666666665"/>
-        <w:gridCol w:w="3009.6666666666665"/>
-        <w:gridCol w:w="3009.6666666666665"/>
+        <w:gridCol w:w="1650"/>
+        <w:gridCol w:w="5700"/>
+        <w:gridCol w:w="1650"/>
         <w:tblGridChange w:id="0">
           <w:tblGrid>
-            <w:gridCol w:w="3009.6666666666665"/>
-            <w:gridCol w:w="3009.6666666666665"/>
-            <w:gridCol w:w="3009.6666666666665"/>
+            <w:gridCol w:w="1650"/>
+            <w:gridCol w:w="5700"/>
+            <w:gridCol w:w="1650"/>
           </w:tblGrid>
         </w:tblGridChange>
       </w:tblGrid>
@@ -1160,71 +1416,14 @@
           </w:p>
         </w:tc>
       </w:tr>
-      <w:tr>
-        <w:trPr>
-          <w:cantSplit w:val="0"/>
-          <w:tblHeader w:val="0"/>
-        </w:trPr>
-        <w:tc>
-          <w:tcPr/>
-          <w:p>
-            <w:pPr>
-              <w:rPr>
-                <w:color w:val="ff0000"/>
-              </w:rPr>
-            </w:pPr>
-            <w:r>
-              <w:rPr>
-                <w:color w:val="ff0000"/>
-                <w:rtl w:val="0"/>
-              </w:rPr>
-              <w:t xml:space="preserve">…</w:t>
-            </w:r>
-          </w:p>
-        </w:tc>
-        <w:tc>
-          <w:tcPr/>
-          <w:p>
-            <w:pPr>
-              <w:rPr>
-                <w:color w:val="ff0000"/>
-              </w:rPr>
-            </w:pPr>
-            <w:r>
-              <w:rPr>
-                <w:color w:val="ff0000"/>
-                <w:rtl w:val="0"/>
-              </w:rPr>
-              <w:t xml:space="preserve">…</w:t>
-            </w:r>
-          </w:p>
-        </w:tc>
-        <w:tc>
-          <w:tcPr/>
-          <w:p>
-            <w:pPr>
-              <w:rPr>
-                <w:color w:val="ff0000"/>
-              </w:rPr>
-            </w:pPr>
-            <w:r>
-              <w:rPr>
-                <w:color w:val="ff0000"/>
-                <w:rtl w:val="0"/>
-              </w:rPr>
-              <w:t xml:space="preserve">…</w:t>
-            </w:r>
-          </w:p>
-        </w:tc>
-      </w:tr>
     </w:tbl>
     <w:p>
       <w:pPr>
         <w:pStyle w:val="Heading1"/>
         <w:rPr/>
       </w:pPr>
-      <w:bookmarkStart w:colFirst="0" w:colLast="0" w:name="_mq47e8plapvr" w:id="12"/>
-      <w:bookmarkEnd w:id="12"/>
+      <w:bookmarkStart w:colFirst="0" w:colLast="0" w:name="_mq47e8plapvr" w:id="14"/>
+      <w:bookmarkEnd w:id="14"/>
       <w:r>
         <w:rPr>
           <w:rtl w:val="0"/>
@@ -1259,7 +1458,7 @@
     </w:p>
     <w:tbl>
       <w:tblPr>
-        <w:tblStyle w:val="Table2"/>
+        <w:tblStyle w:val="Table3"/>
         <w:tblW w:w="9029.0" w:type="dxa"/>
         <w:jc w:val="left"/>
         <w:tblBorders>
@@ -1433,54 +1632,14 @@
           </w:p>
         </w:tc>
       </w:tr>
-      <w:tr>
-        <w:trPr>
-          <w:cantSplit w:val="0"/>
-          <w:tblHeader w:val="0"/>
-        </w:trPr>
-        <w:tc>
-          <w:tcPr/>
-          <w:p>
-            <w:pPr>
-              <w:rPr>
-                <w:color w:val="ff0000"/>
-              </w:rPr>
-            </w:pPr>
-            <w:r>
-              <w:rPr>
-                <w:color w:val="ff0000"/>
-                <w:rtl w:val="0"/>
-              </w:rPr>
-              <w:t xml:space="preserve">…</w:t>
-            </w:r>
-          </w:p>
-        </w:tc>
-        <w:tc>
-          <w:tcPr/>
-          <w:p>
-            <w:pPr>
-              <w:rPr>
-                <w:color w:val="ff0000"/>
-              </w:rPr>
-            </w:pPr>
-            <w:r>
-              <w:rPr>
-                <w:color w:val="ff0000"/>
-                <w:rtl w:val="0"/>
-              </w:rPr>
-              <w:t xml:space="preserve">…</w:t>
-            </w:r>
-          </w:p>
-        </w:tc>
-      </w:tr>
     </w:tbl>
     <w:p>
       <w:pPr>
         <w:pStyle w:val="Heading1"/>
         <w:rPr/>
       </w:pPr>
-      <w:bookmarkStart w:colFirst="0" w:colLast="0" w:name="_j88lem4pykyg" w:id="13"/>
-      <w:bookmarkEnd w:id="13"/>
+      <w:bookmarkStart w:colFirst="0" w:colLast="0" w:name="_j88lem4pykyg" w:id="15"/>
+      <w:bookmarkEnd w:id="15"/>
       <w:r>
         <w:rPr>
           <w:rtl w:val="0"/>
@@ -1504,8 +1663,8 @@
         <w:pStyle w:val="Heading2"/>
         <w:rPr/>
       </w:pPr>
-      <w:bookmarkStart w:colFirst="0" w:colLast="0" w:name="_101erhvo8y6y" w:id="14"/>
-      <w:bookmarkEnd w:id="14"/>
+      <w:bookmarkStart w:colFirst="0" w:colLast="0" w:name="_101erhvo8y6y" w:id="16"/>
+      <w:bookmarkEnd w:id="16"/>
       <w:r>
         <w:rPr>
           <w:rtl w:val="0"/>
@@ -1515,7 +1674,9 @@
     </w:p>
     <w:p>
       <w:pPr>
-        <w:rPr/>
+        <w:rPr>
+          <w:color w:val="ff0000"/>
+        </w:rPr>
       </w:pPr>
       <w:r>
         <w:rPr/>
@@ -1560,62 +1721,6 @@
     </w:p>
     <w:p>
       <w:pPr>
-        <w:pStyle w:val="Heading2"/>
-        <w:rPr/>
-      </w:pPr>
-      <w:bookmarkStart w:colFirst="0" w:colLast="0" w:name="_78vggiyk03ns" w:id="15"/>
-      <w:bookmarkEnd w:id="15"/>
-      <w:r>
-        <w:rPr>
-          <w:rtl w:val="0"/>
-        </w:rPr>
-        <w:t xml:space="preserve">5.2 Class Diagram</w:t>
-      </w:r>
-    </w:p>
-    <w:p>
-      <w:pPr>
-        <w:rPr>
-          <w:color w:val="ff0000"/>
-        </w:rPr>
-      </w:pPr>
-      <w:r>
-        <w:rPr>
-          <w:color w:val="ff0000"/>
-          <w:rtl w:val="0"/>
-        </w:rPr>
-        <w:t xml:space="preserve">Memodelkan struktur kelas, atribut, metode, dan hubungan antarkelas dalam sistem.</w:t>
-      </w:r>
-    </w:p>
-    <w:p>
-      <w:pPr>
-        <w:pStyle w:val="Heading2"/>
-        <w:rPr/>
-      </w:pPr>
-      <w:bookmarkStart w:colFirst="0" w:colLast="0" w:name="_10fvvku2awts" w:id="16"/>
-      <w:bookmarkEnd w:id="16"/>
-      <w:r>
-        <w:rPr>
-          <w:rtl w:val="0"/>
-        </w:rPr>
-        <w:t xml:space="preserve">5.3 Sequence Diagram</w:t>
-      </w:r>
-    </w:p>
-    <w:p>
-      <w:pPr>
-        <w:rPr>
-          <w:color w:val="ff0000"/>
-        </w:rPr>
-      </w:pPr>
-      <w:r>
-        <w:rPr>
-          <w:color w:val="ff0000"/>
-          <w:rtl w:val="0"/>
-        </w:rPr>
-        <w:t xml:space="preserve">Memodelkan urutan pesan yang dikirim antarobjek dalam skenario tertentu untuk menunjukkan urutan waktu interaksi.</w:t>
-      </w:r>
-    </w:p>
-    <w:p>
-      <w:pPr>
         <w:pStyle w:val="Heading1"/>
         <w:rPr/>
       </w:pPr>
@@ -1636,7 +1741,7 @@
         <w:rPr>
           <w:rtl w:val="0"/>
         </w:rPr>
-        <w:t xml:space="preserve">Digunakan untuk memastikan setiap kebutuhan telah dialokasikan ke dalam perancangan dan pengujian.</w:t>
+        <w:t xml:space="preserve">Digunakan untuk memastikan setiap kebutuhan telah dialokasikan ke dalam perancangan dan pengujian. Status berikut diperbarui berdasarkan hasil regression testing tanggal 21/09/2026 (lihat REGRESSION_TESTING.md dan KNOWN_LIMITATIONS.md di repository untuk detail lengkap).</w:t>
       </w:r>
     </w:p>
     <w:p>
@@ -1666,8 +1771,8 @@
     </w:p>
     <w:tbl>
       <w:tblPr>
-        <w:tblStyle w:val="Table3"/>
-        <w:tblW w:w="9029.0" w:type="dxa"/>
+        <w:tblStyle w:val="Table4"/>
+        <w:tblW w:w="9000.0" w:type="dxa"/>
         <w:jc w:val="left"/>
         <w:tblBorders>
           <w:top w:color="bdc3c7" w:space="0" w:sz="8" w:val="single"/>
@@ -1681,14 +1786,14 @@
         <w:tblLook w:val="0620"/>
       </w:tblPr>
       <w:tblGrid>
-        <w:gridCol w:w="3009.6666666666665"/>
-        <w:gridCol w:w="3009.6666666666665"/>
-        <w:gridCol w:w="3009.6666666666665"/>
+        <w:gridCol w:w="1830"/>
+        <w:gridCol w:w="2505"/>
+        <w:gridCol w:w="4665"/>
         <w:tblGridChange w:id="0">
           <w:tblGrid>
-            <w:gridCol w:w="3009.6666666666665"/>
-            <w:gridCol w:w="3009.6666666666665"/>
-            <w:gridCol w:w="3009.6666666666665"/>
+            <w:gridCol w:w="1830"/>
+            <w:gridCol w:w="2505"/>
+            <w:gridCol w:w="4665"/>
           </w:tblGrid>
         </w:tblGridChange>
       </w:tblGrid>
@@ -1783,7 +1888,7 @@
               <w:rPr>
                 <w:rtl w:val="0"/>
               </w:rPr>
-              <w:t xml:space="preserve">Belum Terverifikasi </w:t>
+              <w:t xml:space="preserve">Terverifikasi Sebagian. Register, Sign In, session guard (guest/login), dan halaman Akun sudah teruji lewat regression testing (21/09/2026) dan berfungsi normal. SSO Google masih simulasi (belum ada integrasi Google Sign-In SDK sungguhan). Halaman Ubah Sandi belum ditinjau ulang. </w:t>
             </w:r>
           </w:p>
         </w:tc>
@@ -1831,7 +1936,7 @@
               <w:rPr>
                 <w:rtl w:val="0"/>
               </w:rPr>
-              <w:t xml:space="preserve">Belum Terverifikasi </w:t>
+              <w:t xml:space="preserve">Terverifikasi Sebagian. Beranda, halaman Majalah (grid per tahun, Hero banner, chip filter), dan Detail Majalah sudah teruji dan berfungsi normal. Fitur pencarian belum diimplementasikan (ikon ada, logic belum). Kategori "Populer" dan "Gratis" yang disebut di SRS belum diimplementasikan — baru pengelompokan per tahun (Terbaru/2025/2026) yang berfungsi.</w:t>
             </w:r>
           </w:p>
         </w:tc>
@@ -1893,7 +1998,7 @@
               <w:rPr>
                 <w:rtl w:val="0"/>
               </w:rPr>
-              <w:t xml:space="preserve">Belum Terverifikasi </w:t>
+              <w:t xml:space="preserve">Terverifikasi Sebagian. Alur Top Up (pilih metode, nominal, submit, riwayat, konfirmasi WA) sudah teruji dan berfungsi. Alur pembelian majalah (Bottom Sheet, dialog sukses, E-Reader) sudah teruji. Namun saldo pengguna belum benar-benar terpotong otomatis setelah pembelian (baru simulasi tampilan "Sisa Saldo"). Pembelian paket langganan belum diimplementasikan sama sekali (LanggananRepository sudah dibuat tapi belum tersambung ke UI mana pun).</w:t>
             </w:r>
           </w:p>
         </w:tc>
@@ -1941,7 +2046,7 @@
               <w:rPr>
                 <w:rtl w:val="0"/>
               </w:rPr>
-              <w:t xml:space="preserve">Belum Terverifikasi </w:t>
+              <w:t xml:space="preserve">Terverifikasi. Halaman Koleksi (baca &amp; unduh Vol 05/06) sudah teruji, termasuk fix bug persistensi data setelah aplikasi ditutup paksa.</w:t>
             </w:r>
           </w:p>
         </w:tc>
@@ -2003,7 +2108,7 @@
               <w:rPr>
                 <w:rtl w:val="0"/>
               </w:rPr>
-              <w:t xml:space="preserve">Belum Terverifikasi </w:t>
+              <w:t xml:space="preserve">Terverifikasi Sebagian — E-Reader (zoom, fullscreen, lompat halaman, status offline/online) sudah teruji dan berfungsi baik. Namun fitur "Unduh" belum benar-benar mengunduh file — baru simulasi status (SharedPreferences boolean), file PDF belum tersimpan fisik ke penyimpanan HP.</w:t>
             </w:r>
           </w:p>
         </w:tc>
@@ -2678,6 +2783,39 @@
     </w:tblStylePr>
   </w:style>
   <w:style w:type="table" w:styleId="Table3">
+    <w:basedOn w:val="TableNormal"/>
+    <w:tblPr>
+      <w:tblStyleRowBandSize w:val="1"/>
+      <w:tblStyleColBandSize w:val="1"/>
+      <w:tblCellMar>
+        <w:top w:w="160.0" w:type="dxa"/>
+        <w:left w:w="200.0" w:type="dxa"/>
+        <w:bottom w:w="160.0" w:type="dxa"/>
+        <w:right w:w="200.0" w:type="dxa"/>
+      </w:tblCellMar>
+    </w:tblPr>
+    <w:tcPr>
+      <w:shd w:fill="ffffff" w:val="clear"/>
+      <w:vAlign w:val="center"/>
+    </w:tcPr>
+    <w:tblStylePr w:type="firstRow">
+      <w:rPr>
+        <w:rFonts w:ascii="Montserrat" w:cs="Montserrat" w:eastAsia="Montserrat" w:hAnsi="Montserrat"/>
+        <w:b w:val="1"/>
+        <w:bCs w:val="1"/>
+        <w:i w:val="0"/>
+        <w:iCs w:val="0"/>
+        <w:color w:val="2c3e50"/>
+        <w:sz w:val="24"/>
+        <w:szCs w:val="24"/>
+      </w:rPr>
+      <w:tcPr>
+        <w:shd w:fill="f8f9fa" w:val="clear"/>
+        <w:vAlign w:val="center"/>
+      </w:tcPr>
+    </w:tblStylePr>
+  </w:style>
+  <w:style w:type="table" w:styleId="Table4">
     <w:basedOn w:val="TableNormal"/>
     <w:tblPr>
       <w:tblStyleRowBandSize w:val="1"/>

</xml_diff>

<commit_message>
docs: update SRS to v1.2 with notification, editorial preview, and new NFRs
</commit_message>
<xml_diff>
--- a/docs/SRS_Pustaka_Pangan.docx
+++ b/docs/SRS_Pustaka_Pangan.docx
@@ -60,7 +60,7 @@
         <w:rPr>
           <w:rtl w:val="0"/>
         </w:rPr>
-        <w:t xml:space="preserve"> 1.1</w:t>
+        <w:t xml:space="preserve"> 1.2</w:t>
       </w:r>
     </w:p>
     <w:p>
@@ -108,14 +108,14 @@
       <w:tblGrid>
         <w:gridCol w:w="1080"/>
         <w:gridCol w:w="1920"/>
-        <w:gridCol w:w="4575"/>
-        <w:gridCol w:w="1365"/>
+        <w:gridCol w:w="4980"/>
+        <w:gridCol w:w="960"/>
         <w:tblGridChange w:id="0">
           <w:tblGrid>
             <w:gridCol w:w="1080"/>
             <w:gridCol w:w="1920"/>
-            <w:gridCol w:w="4575"/>
-            <w:gridCol w:w="1365"/>
+            <w:gridCol w:w="4980"/>
+            <w:gridCol w:w="960"/>
           </w:tblGrid>
         </w:tblGridChange>
       </w:tblGrid>
@@ -305,27 +305,76 @@
           </w:p>
         </w:tc>
       </w:tr>
+      <w:tr>
+        <w:trPr>
+          <w:cantSplit w:val="0"/>
+          <w:tblHeader w:val="0"/>
+        </w:trPr>
+        <w:tc>
+          <w:tcPr/>
+          <w:p>
+            <w:pPr>
+              <w:rPr/>
+            </w:pPr>
+            <w:r>
+              <w:rPr>
+                <w:rtl w:val="0"/>
+              </w:rPr>
+              <w:t xml:space="preserve">1.2</w:t>
+            </w:r>
+          </w:p>
+        </w:tc>
+        <w:tc>
+          <w:tcPr/>
+          <w:p>
+            <w:pPr>
+              <w:rPr/>
+            </w:pPr>
+            <w:r>
+              <w:rPr>
+                <w:rtl w:val="0"/>
+              </w:rPr>
+              <w:t xml:space="preserve">28/09/2026</w:t>
+            </w:r>
+          </w:p>
+        </w:tc>
+        <w:tc>
+          <w:tcPr/>
+          <w:p>
+            <w:pPr>
+              <w:rPr/>
+            </w:pPr>
+            <w:r>
+              <w:rPr>
+                <w:rtl w:val="0"/>
+              </w:rPr>
+              <w:t xml:space="preserve">Pembaruan setelah sprint integrasi backend Supabase: menambah kebutuhan SRS_F_008 (Notifikasi) dan SRS_F_009 (Pratinjau Editorial), menambah 3 kebutuhan non-fungsional (keamanan transaksi, efisiensi data, ketersediaan luring), memperbarui Definisi, Referensi, Perspektif Produk, Batasan Umum, serta status Requirements Traceability Matrix (Bagian 6). Status menunggu verifikasi regression testing 29/09/2026.</w:t>
+            </w:r>
+          </w:p>
+        </w:tc>
+        <w:tc>
+          <w:tcPr/>
+          <w:p>
+            <w:pPr>
+              <w:rPr/>
+            </w:pPr>
+            <w:r>
+              <w:rPr>
+                <w:rtl w:val="0"/>
+              </w:rPr>
+              <w:t xml:space="preserve">Tifa</w:t>
+            </w:r>
+          </w:p>
+        </w:tc>
+      </w:tr>
     </w:tbl>
     <w:p>
       <w:pPr>
         <w:pStyle w:val="Heading1"/>
         <w:rPr/>
       </w:pPr>
-      <w:bookmarkStart w:colFirst="0" w:colLast="0" w:name="_ivg4yeiywmw7" w:id="2"/>
+      <w:bookmarkStart w:colFirst="0" w:colLast="0" w:name="_rsge37298wjg" w:id="2"/>
       <w:bookmarkEnd w:id="2"/>
-      <w:r>
-        <w:rPr>
-          <w:rtl w:val="0"/>
-        </w:rPr>
-      </w:r>
-    </w:p>
-    <w:p>
-      <w:pPr>
-        <w:pStyle w:val="Heading1"/>
-        <w:rPr/>
-      </w:pPr>
-      <w:bookmarkStart w:colFirst="0" w:colLast="0" w:name="_rsge37298wjg" w:id="3"/>
-      <w:bookmarkEnd w:id="3"/>
       <w:r>
         <w:rPr>
           <w:rtl w:val="0"/>
@@ -338,8 +387,8 @@
         <w:pStyle w:val="Heading2"/>
         <w:rPr/>
       </w:pPr>
-      <w:bookmarkStart w:colFirst="0" w:colLast="0" w:name="_c4qk5bmzfwcp" w:id="4"/>
-      <w:bookmarkEnd w:id="4"/>
+      <w:bookmarkStart w:colFirst="0" w:colLast="0" w:name="_c4qk5bmzfwcp" w:id="3"/>
+      <w:bookmarkEnd w:id="3"/>
       <w:r>
         <w:rPr>
           <w:rtl w:val="0"/>
@@ -364,8 +413,8 @@
         <w:pStyle w:val="Heading2"/>
         <w:rPr/>
       </w:pPr>
-      <w:bookmarkStart w:colFirst="0" w:colLast="0" w:name="_4vimkb8f2hq5" w:id="5"/>
-      <w:bookmarkEnd w:id="5"/>
+      <w:bookmarkStart w:colFirst="0" w:colLast="0" w:name="_4vimkb8f2hq5" w:id="4"/>
+      <w:bookmarkEnd w:id="4"/>
       <w:r>
         <w:rPr>
           <w:rtl w:val="0"/>
@@ -474,8 +523,8 @@
         <w:pStyle w:val="Heading2"/>
         <w:rPr/>
       </w:pPr>
-      <w:bookmarkStart w:colFirst="0" w:colLast="0" w:name="_bks5viubu6wa" w:id="6"/>
-      <w:bookmarkEnd w:id="6"/>
+      <w:bookmarkStart w:colFirst="0" w:colLast="0" w:name="_bks5viubu6wa" w:id="5"/>
+      <w:bookmarkEnd w:id="5"/>
       <w:r>
         <w:rPr>
           <w:rtl w:val="0"/>
@@ -627,20 +676,6 @@
     </w:p>
     <w:p>
       <w:pPr>
-        <w:pStyle w:val="Heading2"/>
-        <w:rPr/>
-      </w:pPr>
-      <w:bookmarkStart w:colFirst="0" w:colLast="0" w:name="_kso96fcb7dsi" w:id="7"/>
-      <w:bookmarkEnd w:id="7"/>
-      <w:r>
-        <w:rPr>
-          <w:rtl w:val="0"/>
-        </w:rPr>
-        <w:t xml:space="preserve">1.4 Referensi</w:t>
-      </w:r>
-    </w:p>
-    <w:p>
-      <w:pPr>
         <w:numPr>
           <w:ilvl w:val="0"/>
           <w:numId w:val="1"/>
@@ -649,6 +684,131 @@
       </w:pPr>
       <w:r>
         <w:rPr>
+          <w:b w:val="1"/>
+          <w:bCs w:val="1"/>
+          <w:rtl w:val="0"/>
+        </w:rPr>
+        <w:t xml:space="preserve">Supabase: </w:t>
+      </w:r>
+      <w:r>
+        <w:rPr>
+          <w:rtl w:val="0"/>
+        </w:rPr>
+        <w:t xml:space="preserve">Platform </w:t>
+      </w:r>
+      <w:r>
+        <w:rPr>
+          <w:i w:val="1"/>
+          <w:iCs w:val="1"/>
+          <w:rtl w:val="0"/>
+        </w:rPr>
+        <w:t xml:space="preserve">Backend-as-a-Service</w:t>
+      </w:r>
+      <w:r>
+        <w:rPr>
+          <w:rtl w:val="0"/>
+        </w:rPr>
+        <w:t xml:space="preserve"> berbasis PostgreSQL yang menyediakan basis data, autentikasi, dan penyimpanan file (</w:t>
+      </w:r>
+      <w:r>
+        <w:rPr>
+          <w:i w:val="1"/>
+          <w:iCs w:val="1"/>
+          <w:rtl w:val="0"/>
+        </w:rPr>
+        <w:t xml:space="preserve">Storage</w:t>
+      </w:r>
+      <w:r>
+        <w:rPr>
+          <w:rtl w:val="0"/>
+        </w:rPr>
+        <w:t xml:space="preserve">) untuk prototipe ini.</w:t>
+      </w:r>
+    </w:p>
+    <w:p>
+      <w:pPr>
+        <w:numPr>
+          <w:ilvl w:val="0"/>
+          <w:numId w:val="1"/>
+        </w:numPr>
+        <w:ind w:left="720" w:hanging="360"/>
+      </w:pPr>
+      <w:r>
+        <w:rPr>
+          <w:b w:val="1"/>
+          <w:bCs w:val="1"/>
+          <w:rtl w:val="0"/>
+        </w:rPr>
+        <w:t xml:space="preserve">RLS (Row Level Security): </w:t>
+      </w:r>
+      <w:r>
+        <w:rPr>
+          <w:rtl w:val="0"/>
+        </w:rPr>
+        <w:t xml:space="preserve">Aturan akses di tingkat baris basis data yang memastikan pengguna hanya dapat membaca atau mengubah data miliknya sendiri.</w:t>
+      </w:r>
+    </w:p>
+    <w:p>
+      <w:pPr>
+        <w:numPr>
+          <w:ilvl w:val="0"/>
+          <w:numId w:val="1"/>
+        </w:numPr>
+        <w:ind w:left="720" w:hanging="360"/>
+      </w:pPr>
+      <w:r>
+        <w:rPr>
+          <w:b w:val="1"/>
+          <w:bCs w:val="1"/>
+          <w:rtl w:val="0"/>
+        </w:rPr>
+        <w:t xml:space="preserve">Cache: </w:t>
+      </w:r>
+      <w:r>
+        <w:rPr>
+          <w:rtl w:val="0"/>
+        </w:rPr>
+        <w:t xml:space="preserve">Penyimpanan sementara pada perangkat yang dapat dihapus otomatis oleh sistem Android saat memori menipis (berbeda dengan </w:t>
+      </w:r>
+      <w:r>
+        <w:rPr>
+          <w:i w:val="1"/>
+          <w:iCs w:val="1"/>
+          <w:rtl w:val="0"/>
+        </w:rPr>
+        <w:t xml:space="preserve">Local Storage</w:t>
+      </w:r>
+      <w:r>
+        <w:rPr>
+          <w:rtl w:val="0"/>
+        </w:rPr>
+        <w:t xml:space="preserve">).</w:t>
+      </w:r>
+    </w:p>
+    <w:p>
+      <w:pPr>
+        <w:pStyle w:val="Heading2"/>
+        <w:rPr/>
+      </w:pPr>
+      <w:bookmarkStart w:colFirst="0" w:colLast="0" w:name="_kso96fcb7dsi" w:id="6"/>
+      <w:bookmarkEnd w:id="6"/>
+      <w:r>
+        <w:rPr>
+          <w:rtl w:val="0"/>
+        </w:rPr>
+        <w:t xml:space="preserve">1.4 Referensi</w:t>
+      </w:r>
+    </w:p>
+    <w:p>
+      <w:pPr>
+        <w:numPr>
+          <w:ilvl w:val="0"/>
+          <w:numId w:val="1"/>
+        </w:numPr>
+        <w:ind w:left="720" w:hanging="360"/>
+      </w:pPr>
+      <w:r>
+        <w:rPr>
           <w:i w:val="1"/>
           <w:iCs w:val="1"/>
           <w:color w:val="000000"/>
@@ -661,7 +821,68 @@
           <w:color w:val="000000"/>
           <w:rtl w:val="0"/>
         </w:rPr>
-        <w:t xml:space="preserve"> web pustakapangan.com</w:t>
+        <w:t xml:space="preserve"> web </w:t>
+      </w:r>
+      <w:hyperlink r:id="rId6">
+        <w:r>
+          <w:rPr>
+            <w:color w:val="1155cc"/>
+            <w:u w:val="single"/>
+            <w:rtl w:val="0"/>
+          </w:rPr>
+          <w:t xml:space="preserve">pustakapangan.com</w:t>
+        </w:r>
+      </w:hyperlink>
+      <w:r>
+        <w:rPr>
+          <w:rtl w:val="0"/>
+        </w:rPr>
+      </w:r>
+    </w:p>
+    <w:p>
+      <w:pPr>
+        <w:numPr>
+          <w:ilvl w:val="0"/>
+          <w:numId w:val="1"/>
+        </w:numPr>
+        <w:ind w:left="720" w:hanging="360"/>
+      </w:pPr>
+      <w:r>
+        <w:rPr>
+          <w:rtl w:val="0"/>
+        </w:rPr>
+        <w:t xml:space="preserve">Repositori GitHub: </w:t>
+      </w:r>
+      <w:hyperlink r:id="rId7">
+        <w:r>
+          <w:rPr>
+            <w:color w:val="1155cc"/>
+            <w:u w:val="single"/>
+            <w:rtl w:val="0"/>
+          </w:rPr>
+          <w:t xml:space="preserve">github.com/latifaanggia/pustaka_pangan</w:t>
+        </w:r>
+      </w:hyperlink>
+      <w:r>
+        <w:rPr>
+          <w:rtl w:val="0"/>
+        </w:rPr>
+        <w:t xml:space="preserve"> </w:t>
+      </w:r>
+    </w:p>
+    <w:p>
+      <w:pPr>
+        <w:numPr>
+          <w:ilvl w:val="0"/>
+          <w:numId w:val="1"/>
+        </w:numPr>
+        <w:ind w:left="720" w:hanging="360"/>
+      </w:pPr>
+      <w:r>
+        <w:rPr>
+          <w:rtl w:val="0"/>
+        </w:rPr>
+        <w:t xml:space="preserve">KNOWN_LIMITATIONS.md (daftar batasan prototipe) dan folder supabase/migrations (skema basis data) di repositori</w:t>
       </w:r>
       <w:r>
         <w:rPr>
@@ -674,8 +895,8 @@
         <w:pStyle w:val="Heading1"/>
         <w:rPr/>
       </w:pPr>
-      <w:bookmarkStart w:colFirst="0" w:colLast="0" w:name="_dnitpenottcc" w:id="8"/>
-      <w:bookmarkEnd w:id="8"/>
+      <w:bookmarkStart w:colFirst="0" w:colLast="0" w:name="_dnitpenottcc" w:id="7"/>
+      <w:bookmarkEnd w:id="7"/>
       <w:r>
         <w:rPr>
           <w:rtl w:val="0"/>
@@ -688,8 +909,8 @@
         <w:pStyle w:val="Heading2"/>
         <w:rPr/>
       </w:pPr>
-      <w:bookmarkStart w:colFirst="0" w:colLast="0" w:name="_hrzyuyin32si" w:id="9"/>
-      <w:bookmarkEnd w:id="9"/>
+      <w:bookmarkStart w:colFirst="0" w:colLast="0" w:name="_hrzyuyin32si" w:id="8"/>
+      <w:bookmarkEnd w:id="8"/>
       <w:r>
         <w:rPr>
           <w:rtl w:val="0"/>
@@ -706,7 +927,33 @@
         <w:rPr>
           <w:rtl w:val="0"/>
         </w:rPr>
-        <w:t xml:space="preserve">Produk ini merupakan aplikasi </w:t>
+        <w:t xml:space="preserve">Produk ini merupakan aplikasi front-end berbasis Android native. Pada tahap prototipe, backend menggunakan Supabase (basis data PostgreSQL, autentikasi, dan penyimpanan file) dengan skema yang dimodelkan dari basis data web pustakapangan.com. Akses data dipusatkan pada lapisan Repository, sehingga integrasi ke REST API resmi di masa mendatang cukup dilakukan pada lapisan tersebut tanpa mengubah tampilan aplikasi.</w:t>
+      </w:r>
+    </w:p>
+    <w:p>
+      <w:pPr>
+        <w:pStyle w:val="Heading2"/>
+        <w:rPr/>
+      </w:pPr>
+      <w:bookmarkStart w:colFirst="0" w:colLast="0" w:name="_16z6ty2azaa9" w:id="9"/>
+      <w:bookmarkEnd w:id="9"/>
+      <w:r>
+        <w:rPr>
+          <w:rtl w:val="0"/>
+        </w:rPr>
+        <w:t xml:space="preserve">2.2 Fungsi Produk</w:t>
+      </w:r>
+    </w:p>
+    <w:p>
+      <w:pPr>
+        <w:jc w:val="both"/>
+        <w:rPr/>
+      </w:pPr>
+      <w:r>
+        <w:rPr>
+          <w:rtl w:val="0"/>
+        </w:rPr>
+        <w:t xml:space="preserve">Fungsi utama dari aplikasi ini meliputi: autentikasi pengguna, penjelajahan katalog majalah (kategori terbaru, populer, dsb), sistem dompet digital untuk </w:t>
       </w:r>
       <w:r>
         <w:rPr>
@@ -714,13 +961,13 @@
           <w:iCs w:val="1"/>
           <w:rtl w:val="0"/>
         </w:rPr>
-        <w:t xml:space="preserve">front-end</w:t>
-      </w:r>
-      <w:r>
-        <w:rPr>
-          <w:rtl w:val="0"/>
-        </w:rPr>
-        <w:t xml:space="preserve"> berbasis Android </w:t>
+        <w:t xml:space="preserve">top up</w:t>
+      </w:r>
+      <w:r>
+        <w:rPr>
+          <w:rtl w:val="0"/>
+        </w:rPr>
+        <w:t xml:space="preserve"> dan pembelian, halaman koleksi pribadi, serta fitur pembaca digital (</w:t>
       </w:r>
       <w:r>
         <w:rPr>
@@ -728,13 +975,13 @@
           <w:iCs w:val="1"/>
           <w:rtl w:val="0"/>
         </w:rPr>
-        <w:t xml:space="preserve">native </w:t>
-      </w:r>
-      <w:r>
-        <w:rPr>
-          <w:rtl w:val="0"/>
-        </w:rPr>
-        <w:t xml:space="preserve">yang terhubung dengan </w:t>
+        <w:t xml:space="preserve">E-Reader</w:t>
+      </w:r>
+      <w:r>
+        <w:rPr>
+          <w:rtl w:val="0"/>
+        </w:rPr>
+        <w:t xml:space="preserve">) yang mendukung akses </w:t>
       </w:r>
       <w:r>
         <w:rPr>
@@ -742,13 +989,13 @@
           <w:iCs w:val="1"/>
           <w:rtl w:val="0"/>
         </w:rPr>
-        <w:t xml:space="preserve">backend </w:t>
-      </w:r>
-      <w:r>
-        <w:rPr>
-          <w:rtl w:val="0"/>
-        </w:rPr>
-        <w:t xml:space="preserve">web Pustaka Pangan yang sudah ada. Aplikasi ini akan berkomunikasi dengan server melalui REST API untuk mengakses basis data pengguna, transaksi, dan konten majalah.</w:t>
+        <w:t xml:space="preserve">offline</w:t>
+      </w:r>
+      <w:r>
+        <w:rPr>
+          <w:rtl w:val="0"/>
+        </w:rPr>
+        <w:t xml:space="preserve">. </w:t>
       </w:r>
     </w:p>
     <w:p>
@@ -756,13 +1003,13 @@
         <w:pStyle w:val="Heading2"/>
         <w:rPr/>
       </w:pPr>
-      <w:bookmarkStart w:colFirst="0" w:colLast="0" w:name="_16z6ty2azaa9" w:id="10"/>
+      <w:bookmarkStart w:colFirst="0" w:colLast="0" w:name="_kkiqhn7v0pwa" w:id="10"/>
       <w:bookmarkEnd w:id="10"/>
       <w:r>
         <w:rPr>
           <w:rtl w:val="0"/>
         </w:rPr>
-        <w:t xml:space="preserve">2.2 Fungsi Produk</w:t>
+        <w:t xml:space="preserve">2.3 Karakteristik Pengguna</w:t>
       </w:r>
     </w:p>
     <w:p>
@@ -774,7 +1021,7 @@
         <w:rPr>
           <w:rtl w:val="0"/>
         </w:rPr>
-        <w:t xml:space="preserve">Fungsi utama dari aplikasi ini meliputi: autentikasi pengguna, penjelajahan katalog majalah (kategori terbaru, populer, dsb), sistem dompet digital untuk </w:t>
+        <w:t xml:space="preserve">Pengguna sistem ini adalah pembaca setia majalah kuliner, praktisi industri pangan, atau </w:t>
       </w:r>
       <w:r>
         <w:rPr>
@@ -782,13 +1029,13 @@
           <w:iCs w:val="1"/>
           <w:rtl w:val="0"/>
         </w:rPr>
-        <w:t xml:space="preserve">top up</w:t>
-      </w:r>
-      <w:r>
-        <w:rPr>
-          <w:rtl w:val="0"/>
-        </w:rPr>
-        <w:t xml:space="preserve"> dan pembelian, halaman koleksi pribadi, serta fitur pembaca digital (</w:t>
+        <w:t xml:space="preserve">food enthusiast</w:t>
+      </w:r>
+      <w:r>
+        <w:rPr>
+          <w:rtl w:val="0"/>
+        </w:rPr>
+        <w:t xml:space="preserve"> yang menginginkan akses konten secara </w:t>
       </w:r>
       <w:r>
         <w:rPr>
@@ -796,27 +1043,13 @@
           <w:iCs w:val="1"/>
           <w:rtl w:val="0"/>
         </w:rPr>
-        <w:t xml:space="preserve">E-Reader</w:t>
-      </w:r>
-      <w:r>
-        <w:rPr>
-          <w:rtl w:val="0"/>
-        </w:rPr>
-        <w:t xml:space="preserve">) yang mendukung akses </w:t>
-      </w:r>
-      <w:r>
-        <w:rPr>
-          <w:i w:val="1"/>
-          <w:iCs w:val="1"/>
-          <w:rtl w:val="0"/>
-        </w:rPr>
-        <w:t xml:space="preserve">offline</w:t>
-      </w:r>
-      <w:r>
-        <w:rPr>
-          <w:rtl w:val="0"/>
-        </w:rPr>
-        <w:t xml:space="preserve">. </w:t>
+        <w:t xml:space="preserve">mobile</w:t>
+      </w:r>
+      <w:r>
+        <w:rPr>
+          <w:rtl w:val="0"/>
+        </w:rPr>
+        <w:t xml:space="preserve">. Pengguna diharapkan memiliki pemahaman dasar dalam mengoperasikan aplikasi belanja atau dompet digital di ponsel pintar.</w:t>
       </w:r>
     </w:p>
     <w:p>
@@ -824,62 +1057,8 @@
         <w:pStyle w:val="Heading2"/>
         <w:rPr/>
       </w:pPr>
-      <w:bookmarkStart w:colFirst="0" w:colLast="0" w:name="_kkiqhn7v0pwa" w:id="11"/>
+      <w:bookmarkStart w:colFirst="0" w:colLast="0" w:name="_4ehy7ipax4ys" w:id="11"/>
       <w:bookmarkEnd w:id="11"/>
-      <w:r>
-        <w:rPr>
-          <w:rtl w:val="0"/>
-        </w:rPr>
-        <w:t xml:space="preserve">2.3 Karakteristik Pengguna</w:t>
-      </w:r>
-    </w:p>
-    <w:p>
-      <w:pPr>
-        <w:jc w:val="both"/>
-        <w:rPr/>
-      </w:pPr>
-      <w:r>
-        <w:rPr>
-          <w:rtl w:val="0"/>
-        </w:rPr>
-        <w:t xml:space="preserve">Pengguna sistem ini adalah pembaca setia majalah kuliner, praktisi industri pangan, atau </w:t>
-      </w:r>
-      <w:r>
-        <w:rPr>
-          <w:i w:val="1"/>
-          <w:iCs w:val="1"/>
-          <w:rtl w:val="0"/>
-        </w:rPr>
-        <w:t xml:space="preserve">food enthusiast</w:t>
-      </w:r>
-      <w:r>
-        <w:rPr>
-          <w:rtl w:val="0"/>
-        </w:rPr>
-        <w:t xml:space="preserve"> yang menginginkan akses konten secara </w:t>
-      </w:r>
-      <w:r>
-        <w:rPr>
-          <w:i w:val="1"/>
-          <w:iCs w:val="1"/>
-          <w:rtl w:val="0"/>
-        </w:rPr>
-        <w:t xml:space="preserve">mobile</w:t>
-      </w:r>
-      <w:r>
-        <w:rPr>
-          <w:rtl w:val="0"/>
-        </w:rPr>
-        <w:t xml:space="preserve">. Pengguna diharapkan memiliki pemahaman dasar dalam mengoperasikan aplikasi belanja atau dompet digital di ponsel pintar.</w:t>
-      </w:r>
-    </w:p>
-    <w:p>
-      <w:pPr>
-        <w:pStyle w:val="Heading2"/>
-        <w:rPr/>
-      </w:pPr>
-      <w:bookmarkStart w:colFirst="0" w:colLast="0" w:name="_4ehy7ipax4ys" w:id="12"/>
-      <w:bookmarkEnd w:id="12"/>
       <w:r>
         <w:rPr>
           <w:rtl w:val="0"/>
@@ -894,15 +1073,26 @@
           <w:numId w:val="2"/>
         </w:numPr>
         <w:ind w:left="720" w:hanging="360"/>
-        <w:rPr>
-          <w:u w:val="none"/>
-        </w:rPr>
-      </w:pPr>
-      <w:r>
-        <w:rPr>
-          <w:rtl w:val="0"/>
-        </w:rPr>
-        <w:t xml:space="preserve">Aplikasi membutuhkan koneksi internet aktif untuk memuat katalog dan melakukan transaksi.</w:t>
+      </w:pPr>
+      <w:r>
+        <w:rPr>
+          <w:rtl w:val="0"/>
+        </w:rPr>
+        <w:t xml:space="preserve">Aplikasi membutuhkan koneksi internet untuk memuat katalog terbaru dan melakukan transaksi; katalog terakhir, daftar koleksi, dan majalah yang telah diunduh tetap dapat diakses secara luring (</w:t>
+      </w:r>
+      <w:r>
+        <w:rPr>
+          <w:i w:val="1"/>
+          <w:iCs w:val="1"/>
+          <w:rtl w:val="0"/>
+        </w:rPr>
+        <w:t xml:space="preserve">offline</w:t>
+      </w:r>
+      <w:r>
+        <w:rPr>
+          <w:rtl w:val="0"/>
+        </w:rPr>
+        <w:t xml:space="preserve">).</w:t>
       </w:r>
     </w:p>
     <w:p>
@@ -912,9 +1102,6 @@
           <w:numId w:val="2"/>
         </w:numPr>
         <w:ind w:left="720" w:hanging="360"/>
-        <w:rPr>
-          <w:u w:val="none"/>
-        </w:rPr>
       </w:pPr>
       <w:r>
         <w:rPr>
@@ -928,8 +1115,8 @@
         <w:pStyle w:val="Heading1"/>
         <w:rPr/>
       </w:pPr>
-      <w:bookmarkStart w:colFirst="0" w:colLast="0" w:name="_7saczgewcldv" w:id="13"/>
-      <w:bookmarkEnd w:id="13"/>
+      <w:bookmarkStart w:colFirst="0" w:colLast="0" w:name="_7saczgewcldv" w:id="12"/>
+      <w:bookmarkEnd w:id="12"/>
       <w:r>
         <w:rPr>
           <w:rtl w:val="0"/>
@@ -1309,6 +1496,7 @@
       <w:tr>
         <w:trPr>
           <w:cantSplit w:val="0"/>
+          <w:trHeight w:val="1215.17578125" w:hRule="atLeast"/>
           <w:tblHeader w:val="0"/>
         </w:trPr>
         <w:tc>
@@ -1416,14 +1604,110 @@
           </w:p>
         </w:tc>
       </w:tr>
+      <w:tr>
+        <w:trPr>
+          <w:cantSplit w:val="0"/>
+          <w:tblHeader w:val="0"/>
+        </w:trPr>
+        <w:tc>
+          <w:tcPr/>
+          <w:p>
+            <w:pPr>
+              <w:rPr/>
+            </w:pPr>
+            <w:r>
+              <w:rPr>
+                <w:rtl w:val="0"/>
+              </w:rPr>
+              <w:t xml:space="preserve">SRS_F_008</w:t>
+            </w:r>
+          </w:p>
+        </w:tc>
+        <w:tc>
+          <w:tcPr/>
+          <w:p>
+            <w:pPr>
+              <w:rPr/>
+            </w:pPr>
+            <w:r>
+              <w:rPr>
+                <w:rtl w:val="0"/>
+              </w:rPr>
+              <w:t xml:space="preserve">Sistem harus menampilkan notifikasi kepada pengguna terkait status top up, terbitnya edisi terbaru, dan informasi akun, baik pada halaman Notifikasi maupun sebagai pop-up saat aplikasi sedang dibuka.</w:t>
+            </w:r>
+          </w:p>
+        </w:tc>
+        <w:tc>
+          <w:tcPr/>
+          <w:p>
+            <w:pPr>
+              <w:rPr/>
+            </w:pPr>
+            <w:r>
+              <w:rPr>
+                <w:rtl w:val="0"/>
+              </w:rPr>
+              <w:t xml:space="preserve">Sedang</w:t>
+            </w:r>
+          </w:p>
+        </w:tc>
+      </w:tr>
+      <w:tr>
+        <w:trPr>
+          <w:cantSplit w:val="0"/>
+          <w:tblHeader w:val="0"/>
+        </w:trPr>
+        <w:tc>
+          <w:tcPr/>
+          <w:p>
+            <w:pPr>
+              <w:rPr/>
+            </w:pPr>
+            <w:r>
+              <w:rPr>
+                <w:rtl w:val="0"/>
+              </w:rPr>
+              <w:t xml:space="preserve">SRS_F_009</w:t>
+            </w:r>
+          </w:p>
+        </w:tc>
+        <w:tc>
+          <w:tcPr/>
+          <w:p>
+            <w:pPr>
+              <w:rPr/>
+            </w:pPr>
+            <w:r>
+              <w:rPr>
+                <w:rtl w:val="0"/>
+              </w:rPr>
+              <w:t xml:space="preserve">Sistem harus menampilkan pratinjau editorial berupa beberapa halaman awal majalah pada halaman detail, sehingga pengguna dapat menilai isi majalah sebelum membeli.</w:t>
+            </w:r>
+          </w:p>
+        </w:tc>
+        <w:tc>
+          <w:tcPr/>
+          <w:p>
+            <w:pPr>
+              <w:rPr/>
+            </w:pPr>
+            <w:r>
+              <w:rPr>
+                <w:rtl w:val="0"/>
+              </w:rPr>
+              <w:t xml:space="preserve">Sedang</w:t>
+            </w:r>
+          </w:p>
+        </w:tc>
+      </w:tr>
     </w:tbl>
     <w:p>
       <w:pPr>
         <w:pStyle w:val="Heading1"/>
         <w:rPr/>
       </w:pPr>
-      <w:bookmarkStart w:colFirst="0" w:colLast="0" w:name="_mq47e8plapvr" w:id="14"/>
-      <w:bookmarkEnd w:id="14"/>
+      <w:bookmarkStart w:colFirst="0" w:colLast="0" w:name="_mq47e8plapvr" w:id="13"/>
+      <w:bookmarkEnd w:id="13"/>
       <w:r>
         <w:rPr>
           <w:rtl w:val="0"/>
@@ -1632,14 +1916,116 @@
           </w:p>
         </w:tc>
       </w:tr>
+      <w:tr>
+        <w:trPr>
+          <w:cantSplit w:val="0"/>
+          <w:tblHeader w:val="0"/>
+        </w:trPr>
+        <w:tc>
+          <w:tcPr/>
+          <w:p>
+            <w:pPr>
+              <w:rPr/>
+            </w:pPr>
+            <w:r>
+              <w:rPr>
+                <w:rtl w:val="0"/>
+              </w:rPr>
+              <w:t xml:space="preserve">Security (Transaksi)</w:t>
+            </w:r>
+          </w:p>
+        </w:tc>
+        <w:tc>
+          <w:tcPr/>
+          <w:p>
+            <w:pPr>
+              <w:rPr/>
+            </w:pPr>
+            <w:r>
+              <w:rPr>
+                <w:rtl w:val="0"/>
+              </w:rPr>
+              <w:t xml:space="preserve">Perubahan saldo hanya dapat dilakukan oleh server melalui fungsi basis data; aplikasi klien tidak memiliki izin mengubah saldo secara langsung, dan saldo top up baru bertambah setelah dikonfirmasi admin.</w:t>
+            </w:r>
+          </w:p>
+        </w:tc>
+      </w:tr>
+      <w:tr>
+        <w:trPr>
+          <w:cantSplit w:val="0"/>
+          <w:tblHeader w:val="0"/>
+        </w:trPr>
+        <w:tc>
+          <w:tcPr/>
+          <w:p>
+            <w:pPr>
+              <w:rPr/>
+            </w:pPr>
+            <w:r>
+              <w:rPr>
+                <w:rtl w:val="0"/>
+              </w:rPr>
+              <w:t xml:space="preserve">Efisiensi Data</w:t>
+            </w:r>
+          </w:p>
+        </w:tc>
+        <w:tc>
+          <w:tcPr/>
+          <w:p>
+            <w:pPr>
+              <w:rPr/>
+            </w:pPr>
+            <w:r>
+              <w:rPr>
+                <w:rtl w:val="0"/>
+              </w:rPr>
+              <w:t xml:space="preserve">Ukuran file PDF majalah dikompresi sekitar 50% sebelum diunggah agar hemat kuota internet, penyimpanan perangkat, dan bandwidth server.</w:t>
+            </w:r>
+          </w:p>
+        </w:tc>
+      </w:tr>
+      <w:tr>
+        <w:trPr>
+          <w:cantSplit w:val="0"/>
+          <w:tblHeader w:val="0"/>
+        </w:trPr>
+        <w:tc>
+          <w:tcPr/>
+          <w:p>
+            <w:pPr>
+              <w:rPr/>
+            </w:pPr>
+            <w:r>
+              <w:rPr>
+                <w:rtl w:val="0"/>
+              </w:rPr>
+              <w:t xml:space="preserve">Availability</w:t>
+            </w:r>
+          </w:p>
+        </w:tc>
+        <w:tc>
+          <w:tcPr/>
+          <w:p>
+            <w:pPr>
+              <w:rPr/>
+            </w:pPr>
+            <w:r>
+              <w:rPr>
+                <w:rtl w:val="0"/>
+              </w:rPr>
+              <w:t xml:space="preserve">Katalog terakhir, daftar koleksi, dan majalah yang telah diunduh tetap dapat diakses tanpa koneksi internet.</w:t>
+            </w:r>
+          </w:p>
+        </w:tc>
+      </w:tr>
     </w:tbl>
     <w:p>
       <w:pPr>
         <w:pStyle w:val="Heading1"/>
         <w:rPr/>
       </w:pPr>
-      <w:bookmarkStart w:colFirst="0" w:colLast="0" w:name="_j88lem4pykyg" w:id="15"/>
-      <w:bookmarkEnd w:id="15"/>
+      <w:bookmarkStart w:colFirst="0" w:colLast="0" w:name="_j88lem4pykyg" w:id="14"/>
+      <w:bookmarkEnd w:id="14"/>
       <w:r>
         <w:rPr>
           <w:rtl w:val="0"/>
@@ -1663,8 +2049,8 @@
         <w:pStyle w:val="Heading2"/>
         <w:rPr/>
       </w:pPr>
-      <w:bookmarkStart w:colFirst="0" w:colLast="0" w:name="_101erhvo8y6y" w:id="16"/>
-      <w:bookmarkEnd w:id="16"/>
+      <w:bookmarkStart w:colFirst="0" w:colLast="0" w:name="_101erhvo8y6y" w:id="15"/>
+      <w:bookmarkEnd w:id="15"/>
       <w:r>
         <w:rPr>
           <w:rtl w:val="0"/>
@@ -1693,7 +2079,7 @@
                     <pic:cNvPicPr preferRelativeResize="0"/>
                   </pic:nvPicPr>
                   <pic:blipFill>
-                    <a:blip r:embed="rId6"/>
+                    <a:blip r:embed="rId8"/>
                     <a:srcRect b="0" l="0" r="0" t="0"/>
                     <a:stretch>
                       <a:fillRect/>
@@ -1724,8 +2110,8 @@
         <w:pStyle w:val="Heading1"/>
         <w:rPr/>
       </w:pPr>
-      <w:bookmarkStart w:colFirst="0" w:colLast="0" w:name="_nnre7rgp235o" w:id="17"/>
-      <w:bookmarkEnd w:id="17"/>
+      <w:bookmarkStart w:colFirst="0" w:colLast="0" w:name="_nnre7rgp235o" w:id="16"/>
+      <w:bookmarkEnd w:id="16"/>
       <w:r>
         <w:rPr>
           <w:rtl w:val="0"/>
@@ -1886,9 +2272,17 @@
             </w:pPr>
             <w:r>
               <w:rPr>
-                <w:rtl w:val="0"/>
-              </w:rPr>
-              <w:t xml:space="preserve">Terverifikasi Sebagian. Register, Sign In, session guard (guest/login), dan halaman Akun sudah teruji lewat regression testing (21/09/2026) dan berfungsi normal. SSO Google masih simulasi (belum ada integrasi Google Sign-In SDK sungguhan). Halaman Ubah Sandi belum ditinjau ulang. </w:t>
+                <w:b w:val="1"/>
+                <w:bCs w:val="1"/>
+                <w:rtl w:val="0"/>
+              </w:rPr>
+              <w:t xml:space="preserve">Terverifikasi Sebagian</w:t>
+            </w:r>
+            <w:r>
+              <w:rPr>
+                <w:rtl w:val="0"/>
+              </w:rPr>
+              <w:t xml:space="preserve">. Register, Sign In, session guard (guest/login), dan halaman Akun sudah teruji lewat regression testing (21/09/2026) dan berfungsi normal. SSO Google masih simulasi (belum ada integrasi Google Sign-In SDK sungguhan). Halaman Ubah Sandi belum ditinjau ulang. </w:t>
             </w:r>
           </w:p>
         </w:tc>
@@ -1936,7 +2330,7 @@
               <w:rPr>
                 <w:rtl w:val="0"/>
               </w:rPr>
-              <w:t xml:space="preserve">Terverifikasi Sebagian. Beranda, halaman Majalah (grid per tahun, Hero banner, chip filter), dan Detail Majalah sudah teruji dan berfungsi normal. Fitur pencarian belum diimplementasikan (ikon ada, logic belum). Kategori "Populer" dan "Gratis" yang disebut di SRS belum diimplementasikan — baru pengelompokan per tahun (Terbaru/2025/2026) yang berfungsi.</w:t>
+              <w:t xml:space="preserve">Terimplementasi Sebagian. Kategori Terbaru, Populer (berdasarkan jumlah pembeli), dan Gratis di Beranda kini berfungsi dan dapat dipilih. Halaman Majalah memuat 29 edisi (2020–2026, 3 brand) dari Supabase, dikelompokkan per tahun dengan chip tahun otomatis dan urutan edisi terbaru. Detail Majalah menampilkan status Beli / Baca Gratis / Baca Sekarang / Segera Tersedia. Fitur pencarian belum diimplementasikan.</w:t>
             </w:r>
           </w:p>
         </w:tc>
@@ -1998,7 +2392,7 @@
               <w:rPr>
                 <w:rtl w:val="0"/>
               </w:rPr>
-              <w:t xml:space="preserve">Terverifikasi Sebagian. Alur Top Up (pilih metode, nominal, submit, riwayat, konfirmasi WA) sudah teruji dan berfungsi. Alur pembelian majalah (Bottom Sheet, dialog sukses, E-Reader) sudah teruji. Namun saldo pengguna belum benar-benar terpotong otomatis setelah pembelian (baru simulasi tampilan "Sisa Saldo"). Pembelian paket langganan belum diimplementasikan sama sekali (LanggananRepository sudah dibuat tapi belum tersambung ke UI mana pun).</w:t>
+              <w:t xml:space="preserve">Terimplementasi Sebagian. Pembelian kini memotong saldo sungguhan melalui fungsi basis data atomik (cek saldo, potong saldo, dan catat pembelian dalam satu transaksi); majalah yang sama tidak dapat dibeli dua kali. Saldo bertambah otomatis setelah admin mengonfirmasi top up (status Berhasil). Pembelian paket langganan belum diimplementasikan.</w:t>
             </w:r>
           </w:p>
         </w:tc>
@@ -2046,7 +2440,7 @@
               <w:rPr>
                 <w:rtl w:val="0"/>
               </w:rPr>
-              <w:t xml:space="preserve">Terverifikasi. Halaman Koleksi (baca &amp; unduh Vol 05/06) sudah teruji, termasuk fix bug persistensi data setelah aplikasi ditutup paksa.</w:t>
+              <w:t xml:space="preserve">Terimplementasi. Koleksi menampilkan majalah yang benar-benar dibeli atau diambil (gratis) oleh pengguna, dikelompokkan per tahun, beserta kartu Terakhir Dibaca yang melanjutkan halaman terakhir. Koleksi tetap dapat dibuka saat luring.</w:t>
             </w:r>
           </w:p>
         </w:tc>
@@ -2108,7 +2502,151 @@
               <w:rPr>
                 <w:rtl w:val="0"/>
               </w:rPr>
-              <w:t xml:space="preserve">Terverifikasi Sebagian — E-Reader (zoom, fullscreen, lompat halaman, status offline/online) sudah teruji dan berfungsi baik. Namun fitur "Unduh" belum benar-benar mengunduh file — baru simulasi status (SharedPreferences boolean), file PDF belum tersimpan fisik ke penyimpanan HP.</w:t>
+              <w:t xml:space="preserve">Terimplementasi. PDF diunduh sungguhan dari Supabase Storage (baca online disimpan di cache, unduhan luring di local storage) dengan progres unduhan, fitur hapus unduhan, dan penanganan galat (tanpa internet, memori penuh, file tidak ditemukan). E-Reader mendukung pinch-to-zoom ke titik jari dan geser halaman. Aplikasi dapat dibuka dan majalah yang telah diunduh dapat dibaca tanpa internet.</w:t>
+            </w:r>
+          </w:p>
+        </w:tc>
+      </w:tr>
+      <w:tr>
+        <w:trPr>
+          <w:cantSplit w:val="0"/>
+          <w:tblHeader w:val="0"/>
+        </w:trPr>
+        <w:tc>
+          <w:tcPr/>
+          <w:p>
+            <w:pPr>
+              <w:rPr/>
+            </w:pPr>
+            <w:r>
+              <w:rPr>
+                <w:rtl w:val="0"/>
+              </w:rPr>
+              <w:t xml:space="preserve">SRS_F_008</w:t>
+            </w:r>
+          </w:p>
+        </w:tc>
+        <w:tc>
+          <w:tcPr/>
+          <w:p>
+            <w:pPr>
+              <w:rPr/>
+            </w:pPr>
+            <w:r>
+              <w:rPr>
+                <w:rtl w:val="0"/>
+              </w:rPr>
+              <w:t xml:space="preserve">Modul Notifikasi</w:t>
+            </w:r>
+          </w:p>
+        </w:tc>
+        <w:tc>
+          <w:tcPr/>
+          <w:p>
+            <w:pPr>
+              <w:rPr/>
+            </w:pPr>
+            <w:r>
+              <w:rPr>
+                <w:rtl w:val="0"/>
+              </w:rPr>
+              <w:t xml:space="preserve">Terimplementasi Sebagian. Notifikasi dibuat otomatis oleh basis data (top up dikonfirmasi/ditolak, edisi terbaru, akun baru) dan tampil di halaman Notifikasi, badge lonceng, serta pop-up di dalam aplikasi (dicek setiap 30 detik). Push notification saat aplikasi ditutup ditunda sesuai kesepakatan dengan mentor (28/09/2026).</w:t>
+            </w:r>
+          </w:p>
+        </w:tc>
+      </w:tr>
+      <w:tr>
+        <w:trPr>
+          <w:cantSplit w:val="0"/>
+          <w:tblHeader w:val="0"/>
+        </w:trPr>
+        <w:tc>
+          <w:tcPr/>
+          <w:p>
+            <w:pPr>
+              <w:rPr/>
+            </w:pPr>
+            <w:r>
+              <w:rPr>
+                <w:rtl w:val="0"/>
+              </w:rPr>
+              <w:t xml:space="preserve">SRS_F_009</w:t>
+            </w:r>
+          </w:p>
+        </w:tc>
+        <w:tc>
+          <w:tcPr/>
+          <w:p>
+            <w:pPr>
+              <w:rPr/>
+            </w:pPr>
+            <w:r>
+              <w:rPr>
+                <w:rtl w:val="0"/>
+              </w:rPr>
+              <w:t xml:space="preserve">Modul Pratinjau Editorial</w:t>
+            </w:r>
+          </w:p>
+        </w:tc>
+        <w:tc>
+          <w:tcPr/>
+          <w:p>
+            <w:pPr>
+              <w:rPr/>
+            </w:pPr>
+            <w:r>
+              <w:rPr>
+                <w:rtl w:val="0"/>
+              </w:rPr>
+              <w:t xml:space="preserve">Terimplementasi. Halaman 1–6 dari 14 majalah yang tersedia dimuat dari Supabase Storage; majalah yang belum tersedia menampilkan cover.</w:t>
+            </w:r>
+          </w:p>
+        </w:tc>
+      </w:tr>
+      <w:tr>
+        <w:trPr>
+          <w:cantSplit w:val="0"/>
+          <w:tblHeader w:val="0"/>
+        </w:trPr>
+        <w:tc>
+          <w:tcPr/>
+          <w:p>
+            <w:pPr>
+              <w:rPr/>
+            </w:pPr>
+            <w:r>
+              <w:rPr>
+                <w:rtl w:val="0"/>
+              </w:rPr>
+              <w:t xml:space="preserve">NFR Security</w:t>
+            </w:r>
+          </w:p>
+        </w:tc>
+        <w:tc>
+          <w:tcPr/>
+          <w:p>
+            <w:pPr>
+              <w:rPr/>
+            </w:pPr>
+            <w:r>
+              <w:rPr>
+                <w:rtl w:val="0"/>
+              </w:rPr>
+              <w:t xml:space="preserve">Keamanan Akses Konten (unduhan PDF)</w:t>
+            </w:r>
+          </w:p>
+        </w:tc>
+        <w:tc>
+          <w:tcPr/>
+          <w:p>
+            <w:pPr>
+              <w:rPr/>
+            </w:pPr>
+            <w:r>
+              <w:rPr>
+                <w:rtl w:val="0"/>
+              </w:rPr>
+              <w:t xml:space="preserve">Belum Terpenuhi. Transaksi dan saldo sudah dilindungi RLS dan fungsi basis data, namun bucket PDF masih publik sehingga file dapat diakses melalui URL langsung. Rencana produksi: bucket privat dengan pengecekan pembelian dan signed URL berumur pendek.</w:t>
             </w:r>
           </w:p>
         </w:tc>

</xml_diff>

<commit_message>
docs: update SRS v1.3 and regression retest results (29 Sep)
</commit_message>
<xml_diff>
--- a/docs/SRS_Pustaka_Pangan.docx
+++ b/docs/SRS_Pustaka_Pangan.docx
@@ -60,7 +60,7 @@
         <w:rPr>
           <w:rtl w:val="0"/>
         </w:rPr>
-        <w:t xml:space="preserve"> 1.2</w:t>
+        <w:t xml:space="preserve"> 1.3</w:t>
       </w:r>
     </w:p>
     <w:p>
@@ -286,7 +286,7 @@
               <w:rPr>
                 <w:rtl w:val="0"/>
               </w:rPr>
-              <w:t xml:space="preserve">Updata Requirements Traceability Matrix (Bagian 6) berdasarkan hasil regression testing tanggal 21/09/2026. Menambahkan catatan gap implementasi: fitur pencarian, kategori Populer/Gratis, pemotongan saldo otomatis. pembelian paket langganan, dan unduhan file PDF sungguhan belum diimplementasikan.</w:t>
+              <w:t xml:space="preserve">Update Requirements Traceability Matrix (Bagian 6) berdasarkan hasil regression testing tanggal 21/09/2026. Menambahkan catatan gap implementasi: fitur pencarian, kategori Populer/Gratis, pemotongan saldo otomatis. pembelian paket langganan, dan unduhan file PDF sungguhan belum diimplementasikan.</w:t>
             </w:r>
           </w:p>
         </w:tc>
@@ -349,6 +349,68 @@
                 <w:rtl w:val="0"/>
               </w:rPr>
               <w:t xml:space="preserve">Pembaruan setelah sprint integrasi backend Supabase: menambah kebutuhan SRS_F_008 (Notifikasi) dan SRS_F_009 (Pratinjau Editorial), menambah 3 kebutuhan non-fungsional (keamanan transaksi, efisiensi data, ketersediaan luring), memperbarui Definisi, Referensi, Perspektif Produk, Batasan Umum, serta status Requirements Traceability Matrix (Bagian 6). Status menunggu verifikasi regression testing 29/09/2026.</w:t>
+            </w:r>
+          </w:p>
+        </w:tc>
+        <w:tc>
+          <w:tcPr/>
+          <w:p>
+            <w:pPr>
+              <w:rPr/>
+            </w:pPr>
+            <w:r>
+              <w:rPr>
+                <w:rtl w:val="0"/>
+              </w:rPr>
+              <w:t xml:space="preserve">Tifa</w:t>
+            </w:r>
+          </w:p>
+        </w:tc>
+      </w:tr>
+      <w:tr>
+        <w:trPr>
+          <w:cantSplit w:val="0"/>
+          <w:tblHeader w:val="0"/>
+        </w:trPr>
+        <w:tc>
+          <w:tcPr/>
+          <w:p>
+            <w:pPr>
+              <w:rPr/>
+            </w:pPr>
+            <w:r>
+              <w:rPr>
+                <w:rtl w:val="0"/>
+              </w:rPr>
+              <w:t xml:space="preserve">1.3</w:t>
+            </w:r>
+          </w:p>
+        </w:tc>
+        <w:tc>
+          <w:tcPr/>
+          <w:p>
+            <w:pPr>
+              <w:rPr/>
+            </w:pPr>
+            <w:r>
+              <w:rPr>
+                <w:rtl w:val="0"/>
+              </w:rPr>
+              <w:t xml:space="preserve">29/09/2026</w:t>
+            </w:r>
+          </w:p>
+        </w:tc>
+        <w:tc>
+          <w:tcPr/>
+          <w:p>
+            <w:pPr>
+              <w:rPr/>
+            </w:pPr>
+            <w:r>
+              <w:rPr>
+                <w:rtl w:val="0"/>
+              </w:rPr>
+              <w:t xml:space="preserve">Pembaruan setelah regression testing 29/09/2026 beserta uji ulang perbaikan (commit d51a808): status Requirements Traceability Matrix (Bagian 6) diverifikasi; mencatat perubahan kebutuhan hasil diskusi dengan mentor (pengunjung wajib login untuk membaca majalah gratis); menambah kebutuhan non-fungsional Validasi Data (minimal top up Rp10.000) dan Responsivitas Status; mencatat fitur Ubah Password yang kini berfungsi serta Lupa Password dan pembatalan top up sebagai saran pengembangan.</w:t>
             </w:r>
           </w:p>
         </w:tc>
@@ -884,10 +946,20 @@
         </w:rPr>
         <w:t xml:space="preserve">KNOWN_LIMITATIONS.md (daftar batasan prototipe) dan folder supabase/migrations (skema basis data) di repositori</w:t>
       </w:r>
-      <w:r>
-        <w:rPr>
-          <w:rtl w:val="0"/>
-        </w:rPr>
+    </w:p>
+    <w:p>
+      <w:pPr>
+        <w:numPr>
+          <w:ilvl w:val="0"/>
+          <w:numId w:val="1"/>
+        </w:numPr>
+        <w:ind w:left="720" w:hanging="360"/>
+      </w:pPr>
+      <w:r>
+        <w:rPr>
+          <w:rtl w:val="0"/>
+        </w:rPr>
+        <w:t xml:space="preserve">Dokumen Regression Testing 21/09/2026 dan 29/09/2026 (folder docs/testing di repositori)</w:t>
       </w:r>
     </w:p>
     <w:p>
@@ -1108,6 +1180,35 @@
           <w:rtl w:val="0"/>
         </w:rPr>
         <w:t xml:space="preserve">Aplikasi dirancang minimal untuk sistem operasi Android 8.0 (Oreo) ke atas.</w:t>
+      </w:r>
+    </w:p>
+    <w:p>
+      <w:pPr>
+        <w:numPr>
+          <w:ilvl w:val="0"/>
+          <w:numId w:val="2"/>
+        </w:numPr>
+        <w:ind w:left="720" w:hanging="360"/>
+      </w:pPr>
+      <w:r>
+        <w:rPr>
+          <w:rtl w:val="0"/>
+        </w:rPr>
+        <w:t xml:space="preserve">Pengunjung yang belum login (</w:t>
+      </w:r>
+      <w:r>
+        <w:rPr>
+          <w:i w:val="1"/>
+          <w:iCs w:val="1"/>
+          <w:rtl w:val="0"/>
+        </w:rPr>
+        <w:t xml:space="preserve">guest</w:t>
+      </w:r>
+      <w:r>
+        <w:rPr>
+          <w:rtl w:val="0"/>
+        </w:rPr>
+        <w:t xml:space="preserve">) hanya dapat melihat katalog, detail majalah, dan pratinjau editorial. Membeli maupun membaca majalah, termasuk majalah gratis, mewajibkan login (keputusan bersama mentor, 29/09/2026).</w:t>
       </w:r>
     </w:p>
     <w:p>
@@ -2018,6 +2119,74 @@
           </w:p>
         </w:tc>
       </w:tr>
+      <w:tr>
+        <w:trPr>
+          <w:cantSplit w:val="0"/>
+          <w:tblHeader w:val="0"/>
+        </w:trPr>
+        <w:tc>
+          <w:tcPr/>
+          <w:p>
+            <w:pPr>
+              <w:rPr/>
+            </w:pPr>
+            <w:r>
+              <w:rPr>
+                <w:rtl w:val="0"/>
+              </w:rPr>
+              <w:t xml:space="preserve">Validasi Data</w:t>
+            </w:r>
+          </w:p>
+        </w:tc>
+        <w:tc>
+          <w:tcPr/>
+          <w:p>
+            <w:pPr>
+              <w:rPr/>
+            </w:pPr>
+            <w:r>
+              <w:rPr>
+                <w:rtl w:val="0"/>
+              </w:rPr>
+              <w:t xml:space="preserve">Nominal top up minimal Rp10.000. Nominal kosong atau nol ditolak oleh aplikasi sebelum dikirim, dan nominal nol atau negatif juga ditolak oleh basis data (check constraint) sebagai lapis pengaman kedua.</w:t>
+            </w:r>
+          </w:p>
+        </w:tc>
+      </w:tr>
+      <w:tr>
+        <w:trPr>
+          <w:cantSplit w:val="0"/>
+          <w:tblHeader w:val="0"/>
+        </w:trPr>
+        <w:tc>
+          <w:tcPr/>
+          <w:p>
+            <w:pPr>
+              <w:rPr/>
+            </w:pPr>
+            <w:r>
+              <w:rPr>
+                <w:rtl w:val="0"/>
+              </w:rPr>
+              <w:t xml:space="preserve">Responsivitas Status</w:t>
+            </w:r>
+          </w:p>
+        </w:tc>
+        <w:tc>
+          <w:tcPr/>
+          <w:p>
+            <w:pPr>
+              <w:rPr/>
+            </w:pPr>
+            <w:r>
+              <w:rPr>
+                <w:rtl w:val="0"/>
+              </w:rPr>
+              <w:t xml:space="preserve">Perubahan status top up oleh admin harus tampil di aplikasi (pop-up notifikasi dan status di Riwayat Top Up) paling lambat sekitar 10 detik ketika halaman Riwayat Top Up terbuka, dan sekitar 30 detik di halaman lain, tanpa pengguna perlu membuka ulang halaman.</w:t>
+            </w:r>
+          </w:p>
+        </w:tc>
+      </w:tr>
     </w:tbl>
     <w:p>
       <w:pPr>
@@ -2127,7 +2296,7 @@
         <w:rPr>
           <w:rtl w:val="0"/>
         </w:rPr>
-        <w:t xml:space="preserve">Digunakan untuk memastikan setiap kebutuhan telah dialokasikan ke dalam perancangan dan pengujian. Status berikut diperbarui berdasarkan hasil regression testing tanggal 21/09/2026 (lihat REGRESSION_TESTING.md dan KNOWN_LIMITATIONS.md di repository untuk detail lengkap).</w:t>
+        <w:t xml:space="preserve">Digunakan untuk memastikan setiap kebutuhan telah dialokasikan ke dalam perancangan dan pengujian. Status berikut diperbarui berdasarkan hasil regression testing tanggal 29/09/2026 beserta uji ulang setelah perbaikan bug (commit d51a808): 78 skenario, 77 lolos, 1 gagal (batasan keamanan yang sudah diketahui). Lihat dokumen Regression Testing 29/09/2026 dan KNOWN_LIMITATIONS.md di repositori untuk detail.</w:t>
       </w:r>
     </w:p>
     <w:p>
@@ -2260,7 +2429,7 @@
               <w:rPr>
                 <w:rtl w:val="0"/>
               </w:rPr>
-              <w:t xml:space="preserve">Modul Autentikasi &amp; Profil (Login, Profil, Ubah Sandi) </w:t>
+              <w:t xml:space="preserve">Modul Autentikasi &amp; Profil (Login, Profil, Ubah Sandi)</w:t>
             </w:r>
           </w:p>
         </w:tc>
@@ -2276,13 +2445,27 @@
                 <w:bCs w:val="1"/>
                 <w:rtl w:val="0"/>
               </w:rPr>
-              <w:t xml:space="preserve">Terverifikasi Sebagian</w:t>
-            </w:r>
-            <w:r>
-              <w:rPr>
-                <w:rtl w:val="0"/>
-              </w:rPr>
-              <w:t xml:space="preserve">. Register, Sign In, session guard (guest/login), dan halaman Akun sudah teruji lewat regression testing (21/09/2026) dan berfungsi normal. SSO Google masih simulasi (belum ada integrasi Google Sign-In SDK sungguhan). Halaman Ubah Sandi belum ditinjau ulang. </w:t>
+              <w:t xml:space="preserve">Terverifikasi Sebagian (29/09/2026). </w:t>
+            </w:r>
+            <w:r>
+              <w:rPr>
+                <w:rtl w:val="0"/>
+              </w:rPr>
+              <w:t xml:space="preserve">Register dan Sign In memakai Supabase Auth dengan perpanjangan sesi otomatis, session guard (guest/login), halaman Akun, serta Ubah Password (verifikasi password lama, minimal 8 karakter kombinasi huruf dan angka) lolos pengujian (skenario 1.1–1.7, 2.1–2.4, 3.1–3.4). Belum: SSO Google (menampilkan pesan belum tersedia) dan Lupa Password (menampilkan informasi; rencana: email reset + </w:t>
+            </w:r>
+            <w:r>
+              <w:rPr>
+                <w:i w:val="1"/>
+                <w:iCs w:val="1"/>
+                <w:rtl w:val="0"/>
+              </w:rPr>
+              <w:t xml:space="preserve">deep link</w:t>
+            </w:r>
+            <w:r>
+              <w:rPr>
+                <w:rtl w:val="0"/>
+              </w:rPr>
+              <w:t xml:space="preserve">).</w:t>
             </w:r>
           </w:p>
         </w:tc>
@@ -2302,35 +2485,43 @@
               <w:rPr>
                 <w:rtl w:val="0"/>
               </w:rPr>
-              <w:t xml:space="preserve">SRS_F_002, SRS_F_003 </w:t>
-            </w:r>
-          </w:p>
-        </w:tc>
-        <w:tc>
-          <w:tcPr/>
-          <w:p>
-            <w:pPr>
-              <w:rPr/>
-            </w:pPr>
-            <w:r>
-              <w:rPr>
-                <w:rtl w:val="0"/>
-              </w:rPr>
-              <w:t xml:space="preserve">Modul Katalog &amp; Eksplorasi (Beranda, Pencarian, Detail Majalah) </w:t>
-            </w:r>
-          </w:p>
-        </w:tc>
-        <w:tc>
-          <w:tcPr/>
-          <w:p>
-            <w:pPr>
-              <w:rPr/>
-            </w:pPr>
-            <w:r>
-              <w:rPr>
-                <w:rtl w:val="0"/>
-              </w:rPr>
-              <w:t xml:space="preserve">Terimplementasi Sebagian. Kategori Terbaru, Populer (berdasarkan jumlah pembeli), dan Gratis di Beranda kini berfungsi dan dapat dipilih. Halaman Majalah memuat 29 edisi (2020–2026, 3 brand) dari Supabase, dikelompokkan per tahun dengan chip tahun otomatis dan urutan edisi terbaru. Detail Majalah menampilkan status Beli / Baca Gratis / Baca Sekarang / Segera Tersedia. Fitur pencarian belum diimplementasikan.</w:t>
+              <w:t xml:space="preserve">SRS_F_002, SRS_F_003</w:t>
+            </w:r>
+          </w:p>
+        </w:tc>
+        <w:tc>
+          <w:tcPr/>
+          <w:p>
+            <w:pPr>
+              <w:rPr/>
+            </w:pPr>
+            <w:r>
+              <w:rPr>
+                <w:rtl w:val="0"/>
+              </w:rPr>
+              <w:t xml:space="preserve">Modul Katalog &amp; Eksplorasi (Beranda, Pencarian, Detail Majalah)</w:t>
+            </w:r>
+          </w:p>
+        </w:tc>
+        <w:tc>
+          <w:tcPr/>
+          <w:p>
+            <w:pPr>
+              <w:rPr/>
+            </w:pPr>
+            <w:r>
+              <w:rPr>
+                <w:b w:val="1"/>
+                <w:bCs w:val="1"/>
+                <w:rtl w:val="0"/>
+              </w:rPr>
+              <w:t xml:space="preserve">Terverifikasi Sebagian (29/09/2026). </w:t>
+            </w:r>
+            <w:r>
+              <w:rPr>
+                <w:rtl w:val="0"/>
+              </w:rPr>
+              <w:t xml:space="preserve">Beranda (Terbaru, Populer, Gratis), halaman Majalah (29 edisi 2020–2026, chip tahun, hero Terbaru/Terpopuler/Pilihan dengan Terpopuler berdasarkan pembeli terbanyak), Detail Majalah dengan status Beli / Baca Gratis / Baca Sekarang / Segera Tersedia lolos pengujian (skenario 4.1–4.6, 5.1–5.7, 6.1, 6.7). Pengunjung diarahkan ke Sign In untuk Beli maupun Baca Gratis. Belum: fitur pencarian.</w:t>
             </w:r>
           </w:p>
         </w:tc>
@@ -2350,7 +2541,7 @@
               <w:rPr>
                 <w:rtl w:val="0"/>
               </w:rPr>
-              <w:t xml:space="preserve">SRS_F_004, SRS_F_005 </w:t>
+              <w:t xml:space="preserve">SRS_F_004, SRS_F_005</w:t>
             </w:r>
           </w:p>
         </w:tc>
@@ -2378,21 +2569,29 @@
               <w:rPr>
                 <w:rtl w:val="0"/>
               </w:rPr>
-              <w:t xml:space="preserve">, Konfirmasi Pembelian) </w:t>
-            </w:r>
-          </w:p>
-        </w:tc>
-        <w:tc>
-          <w:tcPr/>
-          <w:p>
-            <w:pPr>
-              <w:rPr/>
-            </w:pPr>
-            <w:r>
-              <w:rPr>
-                <w:rtl w:val="0"/>
-              </w:rPr>
-              <w:t xml:space="preserve">Terimplementasi Sebagian. Pembelian kini memotong saldo sungguhan melalui fungsi basis data atomik (cek saldo, potong saldo, dan catat pembelian dalam satu transaksi); majalah yang sama tidak dapat dibeli dua kali. Saldo bertambah otomatis setelah admin mengonfirmasi top up (status Berhasil). Pembelian paket langganan belum diimplementasikan.</w:t>
+              <w:t xml:space="preserve">, Konfirmasi Pembelian)</w:t>
+            </w:r>
+          </w:p>
+        </w:tc>
+        <w:tc>
+          <w:tcPr/>
+          <w:p>
+            <w:pPr>
+              <w:rPr/>
+            </w:pPr>
+            <w:r>
+              <w:rPr>
+                <w:b w:val="1"/>
+                <w:bCs w:val="1"/>
+                <w:rtl w:val="0"/>
+              </w:rPr>
+              <w:t xml:space="preserve">Terverifikasi Sebagian (29/09/2026). </w:t>
+            </w:r>
+            <w:r>
+              <w:rPr>
+                <w:rtl w:val="0"/>
+              </w:rPr>
+              <w:t xml:space="preserve">Pembelian atomik (saldo terpotong sekali walau tombol ditekan ganda, saldo tetap saat gagal karena offline), top up BCA/QRIS dengan validasi nominal minimal, konfirmasi admin yang menambah saldo, serta Riwayat Top Up yang memperbarui status otomatis dengan jam sesuai zona waktu perangkat lolos pengujian (skenario 6.2–6.10, 7.1–7.8, 12.9). Belum: pembelian paket langganan dan pembatalan top up oleh pengguna.</w:t>
             </w:r>
           </w:p>
         </w:tc>
@@ -2412,7 +2611,7 @@
               <w:rPr>
                 <w:rtl w:val="0"/>
               </w:rPr>
-              <w:t xml:space="preserve">SRS_F_006 </w:t>
+              <w:t xml:space="preserve">SRS_F_006</w:t>
             </w:r>
           </w:p>
         </w:tc>
@@ -2438,9 +2637,17 @@
             </w:pPr>
             <w:r>
               <w:rPr>
-                <w:rtl w:val="0"/>
-              </w:rPr>
-              <w:t xml:space="preserve">Terimplementasi. Koleksi menampilkan majalah yang benar-benar dibeli atau diambil (gratis) oleh pengguna, dikelompokkan per tahun, beserta kartu Terakhir Dibaca yang melanjutkan halaman terakhir. Koleksi tetap dapat dibuka saat luring.</w:t>
+                <w:b w:val="1"/>
+                <w:bCs w:val="1"/>
+                <w:rtl w:val="0"/>
+              </w:rPr>
+              <w:t xml:space="preserve">Terverifikasi (29/09/2026). </w:t>
+            </w:r>
+            <w:r>
+              <w:rPr>
+                <w:rtl w:val="0"/>
+              </w:rPr>
+              <w:t xml:space="preserve">Koleksi menampilkan majalah yang dibeli atau diambil (gratis), dikelompokkan per tahun, kartu Terakhir Dibaca melanjutkan halaman terakhir, dan koleksi antar-akun terpisah (skenario 8.1–8.3, 8.6, 8.10).</w:t>
             </w:r>
           </w:p>
         </w:tc>
@@ -2488,21 +2695,29 @@
               <w:rPr>
                 <w:rtl w:val="0"/>
               </w:rPr>
-              <w:t xml:space="preserve">) </w:t>
-            </w:r>
-          </w:p>
-        </w:tc>
-        <w:tc>
-          <w:tcPr/>
-          <w:p>
-            <w:pPr>
-              <w:rPr/>
-            </w:pPr>
-            <w:r>
-              <w:rPr>
-                <w:rtl w:val="0"/>
-              </w:rPr>
-              <w:t xml:space="preserve">Terimplementasi. PDF diunduh sungguhan dari Supabase Storage (baca online disimpan di cache, unduhan luring di local storage) dengan progres unduhan, fitur hapus unduhan, dan penanganan galat (tanpa internet, memori penuh, file tidak ditemukan). E-Reader mendukung pinch-to-zoom ke titik jari dan geser halaman. Aplikasi dapat dibuka dan majalah yang telah diunduh dapat dibaca tanpa internet.</w:t>
+              <w:t xml:space="preserve">)</w:t>
+            </w:r>
+          </w:p>
+        </w:tc>
+        <w:tc>
+          <w:tcPr/>
+          <w:p>
+            <w:pPr>
+              <w:rPr/>
+            </w:pPr>
+            <w:r>
+              <w:rPr>
+                <w:b w:val="1"/>
+                <w:bCs w:val="1"/>
+                <w:rtl w:val="0"/>
+              </w:rPr>
+              <w:t xml:space="preserve">Terverifikasi (29/09/2026). </w:t>
+            </w:r>
+            <w:r>
+              <w:rPr>
+                <w:rtl w:val="0"/>
+              </w:rPr>
+              <w:t xml:space="preserve">Unduh dan hapus unduhan dari Koleksi maupun menu E-Reader, penanganan galat dengan pesan berbahasa Indonesia, rotasi layar, status baca (Membaca Online / Membaca Offline / Offline · Belum Diunduh), serta zoom, geser, layar penuh, dan lompat halaman lolos pengujian (skenario 8.4–8.9, 9.1–9.4, 10.1–10.5).</w:t>
             </w:r>
           </w:p>
         </w:tc>
@@ -2548,9 +2763,31 @@
             </w:pPr>
             <w:r>
               <w:rPr>
-                <w:rtl w:val="0"/>
-              </w:rPr>
-              <w:t xml:space="preserve">Terimplementasi Sebagian. Notifikasi dibuat otomatis oleh basis data (top up dikonfirmasi/ditolak, edisi terbaru, akun baru) dan tampil di halaman Notifikasi, badge lonceng, serta pop-up di dalam aplikasi (dicek setiap 30 detik). Push notification saat aplikasi ditutup ditunda sesuai kesepakatan dengan mentor (28/09/2026).</w:t>
+                <w:b w:val="1"/>
+                <w:bCs w:val="1"/>
+                <w:rtl w:val="0"/>
+              </w:rPr>
+              <w:t xml:space="preserve">Terverifikasi Sebagian (29/09/2026). </w:t>
+            </w:r>
+            <w:r>
+              <w:rPr>
+                <w:rtl w:val="0"/>
+              </w:rPr>
+              <w:t xml:space="preserve">Notifikasi otomatis dari basis data tampil di halaman Notifikasi, badge lonceng, dan pop-up di dalam aplikasi; status baca tersimpan (skenario 7.4, 7.5, 7.7, 11.1–11.3). Belum: </w:t>
+            </w:r>
+            <w:r>
+              <w:rPr>
+                <w:i w:val="1"/>
+                <w:iCs w:val="1"/>
+                <w:rtl w:val="0"/>
+              </w:rPr>
+              <w:t xml:space="preserve">push notification</w:t>
+            </w:r>
+            <w:r>
+              <w:rPr>
+                <w:rtl w:val="0"/>
+              </w:rPr>
+              <w:t xml:space="preserve"> saat aplikasi ditutup (ditunda sesuai kesepakatan dengan mentor, 28/09/2026).</w:t>
             </w:r>
           </w:p>
         </w:tc>
@@ -2596,9 +2833,17 @@
             </w:pPr>
             <w:r>
               <w:rPr>
-                <w:rtl w:val="0"/>
-              </w:rPr>
-              <w:t xml:space="preserve">Terimplementasi. Halaman 1–6 dari 14 majalah yang tersedia dimuat dari Supabase Storage; majalah yang belum tersedia menampilkan cover.</w:t>
+                <w:b w:val="1"/>
+                <w:bCs w:val="1"/>
+                <w:rtl w:val="0"/>
+              </w:rPr>
+              <w:t xml:space="preserve">Terverifikasi (29/09/2026). </w:t>
+            </w:r>
+            <w:r>
+              <w:rPr>
+                <w:rtl w:val="0"/>
+              </w:rPr>
+              <w:t xml:space="preserve">Halaman 1–6 dari majalah yang tersedia dimuat dari Supabase Storage; majalah yang belum tersedia menampilkan cover (skenario 6.1).</w:t>
             </w:r>
           </w:p>
         </w:tc>
@@ -2618,6 +2863,62 @@
               <w:rPr>
                 <w:rtl w:val="0"/>
               </w:rPr>
+              <w:t xml:space="preserve">NFR Security (Transaksi)</w:t>
+            </w:r>
+          </w:p>
+        </w:tc>
+        <w:tc>
+          <w:tcPr/>
+          <w:p>
+            <w:pPr>
+              <w:rPr/>
+            </w:pPr>
+            <w:r>
+              <w:rPr>
+                <w:rtl w:val="0"/>
+              </w:rPr>
+              <w:t xml:space="preserve">Keamanan Saldo, Top Up, Pembelian, dan Notifikasi</w:t>
+            </w:r>
+          </w:p>
+        </w:tc>
+        <w:tc>
+          <w:tcPr/>
+          <w:p>
+            <w:pPr>
+              <w:rPr/>
+            </w:pPr>
+            <w:r>
+              <w:rPr>
+                <w:b w:val="1"/>
+                <w:bCs w:val="1"/>
+                <w:rtl w:val="0"/>
+              </w:rPr>
+              <w:t xml:space="preserve">Terverifikasi (29/09/2026). </w:t>
+            </w:r>
+            <w:r>
+              <w:rPr>
+                <w:rtl w:val="0"/>
+              </w:rPr>
+              <w:t xml:space="preserve">Diuji langsung di basis data dengan menyamar sebagai pengguna: mengubah saldo sendiri, top up berstatus Berhasil, top up atas nama orang lain, pembelian langsung ke tabel, membeli majalah tanpa PDF, mengubah status top up final, mengakses notifikasi orang lain, dan top up bernominal nol, semuanya ditolak (skenario 12.1–12.7, 12.9).</w:t>
+            </w:r>
+          </w:p>
+        </w:tc>
+      </w:tr>
+      <w:tr>
+        <w:trPr>
+          <w:cantSplit w:val="0"/>
+          <w:tblHeader w:val="0"/>
+        </w:trPr>
+        <w:tc>
+          <w:tcPr/>
+          <w:p>
+            <w:pPr>
+              <w:rPr/>
+            </w:pPr>
+            <w:r>
+              <w:rPr>
+                <w:rtl w:val="0"/>
+              </w:rPr>
               <w:t xml:space="preserve">NFR Security</w:t>
             </w:r>
           </w:p>
@@ -2644,9 +2945,73 @@
             </w:pPr>
             <w:r>
               <w:rPr>
-                <w:rtl w:val="0"/>
-              </w:rPr>
-              <w:t xml:space="preserve">Belum Terpenuhi. Transaksi dan saldo sudah dilindungi RLS dan fungsi basis data, namun bucket PDF masih publik sehingga file dapat diakses melalui URL langsung. Rencana produksi: bucket privat dengan pengecekan pembelian dan signed URL berumur pendek.</w:t>
+                <w:b w:val="1"/>
+                <w:bCs w:val="1"/>
+                <w:rtl w:val="0"/>
+              </w:rPr>
+              <w:t xml:space="preserve">Belum Terpenuhi. </w:t>
+            </w:r>
+            <w:r>
+              <w:rPr>
+                <w:rtl w:val="0"/>
+              </w:rPr>
+              <w:t xml:space="preserve">Bucket PDF masih publik sehingga file dapat diakses melalui URL langsung (skenario 12.8 gagal, sesuai perkiraan). Ditunda setelah demo (keputusan 29/09/2026). Rencana: bucket privat, policy akses berdasarkan data pembelian, dan unduhan dengan token login pengguna.</w:t>
+            </w:r>
+          </w:p>
+        </w:tc>
+      </w:tr>
+      <w:tr>
+        <w:trPr>
+          <w:cantSplit w:val="0"/>
+          <w:tblHeader w:val="0"/>
+        </w:trPr>
+        <w:tc>
+          <w:tcPr/>
+          <w:p>
+            <w:pPr>
+              <w:rPr/>
+            </w:pPr>
+            <w:r>
+              <w:rPr>
+                <w:rtl w:val="0"/>
+              </w:rPr>
+              <w:t xml:space="preserve">NFR Availability, Validasi Data, Responsivitas Status</w:t>
+            </w:r>
+          </w:p>
+        </w:tc>
+        <w:tc>
+          <w:tcPr/>
+          <w:p>
+            <w:pPr>
+              <w:rPr/>
+            </w:pPr>
+            <w:r>
+              <w:rPr>
+                <w:rtl w:val="0"/>
+              </w:rPr>
+              <w:t xml:space="preserve">Mode Luring, Validasi Top Up, Pembaruan Status</w:t>
+            </w:r>
+          </w:p>
+        </w:tc>
+        <w:tc>
+          <w:tcPr/>
+          <w:p>
+            <w:pPr>
+              <w:rPr/>
+            </w:pPr>
+            <w:r>
+              <w:rPr>
+                <w:b w:val="1"/>
+                <w:bCs w:val="1"/>
+                <w:rtl w:val="0"/>
+              </w:rPr>
+              <w:t xml:space="preserve">Terverifikasi (29/09/2026). </w:t>
+            </w:r>
+            <w:r>
+              <w:rPr>
+                <w:rtl w:val="0"/>
+              </w:rPr>
+              <w:t xml:space="preserve">Aplikasi tetap terbuka saat luring dengan data tersimpan (9.1–9.4); nominal top up tidak valid ditolak aplikasi dan basis data (7.6, 12.9); status top up diperbarui otomatis ±10 detik di Riwayat Top Up (7.7).</w:t>
             </w:r>
           </w:p>
         </w:tc>

</xml_diff>

<commit_message>
docs: update SRS v1.3 (adjust)
</commit_message>
<xml_diff>
--- a/docs/SRS_Pustaka_Pangan.docx
+++ b/docs/SRS_Pustaka_Pangan.docx
@@ -92,7 +92,7 @@
     <w:tbl>
       <w:tblPr>
         <w:tblStyle w:val="Table1"/>
-        <w:tblW w:w="8940.0" w:type="dxa"/>
+        <w:tblW w:w="9360.0" w:type="dxa"/>
         <w:jc w:val="left"/>
         <w:tblBorders>
           <w:top w:color="bdc3c7" w:space="0" w:sz="8" w:val="single"/>
@@ -106,16 +106,16 @@
         <w:tblLook w:val="0620"/>
       </w:tblPr>
       <w:tblGrid>
-        <w:gridCol w:w="1080"/>
-        <w:gridCol w:w="1920"/>
-        <w:gridCol w:w="4980"/>
-        <w:gridCol w:w="960"/>
+        <w:gridCol w:w="1050"/>
+        <w:gridCol w:w="1770"/>
+        <w:gridCol w:w="5160"/>
+        <w:gridCol w:w="1380"/>
         <w:tblGridChange w:id="0">
           <w:tblGrid>
-            <w:gridCol w:w="1080"/>
-            <w:gridCol w:w="1920"/>
-            <w:gridCol w:w="4980"/>
-            <w:gridCol w:w="960"/>
+            <w:gridCol w:w="1050"/>
+            <w:gridCol w:w="1770"/>
+            <w:gridCol w:w="5160"/>
+            <w:gridCol w:w="1380"/>
           </w:tblGrid>
         </w:tblGridChange>
       </w:tblGrid>
@@ -286,7 +286,7 @@
               <w:rPr>
                 <w:rtl w:val="0"/>
               </w:rPr>
-              <w:t xml:space="preserve">Update Requirements Traceability Matrix (Bagian 6) berdasarkan hasil regression testing tanggal 21/09/2026. Menambahkan catatan gap implementasi: fitur pencarian, kategori Populer/Gratis, pemotongan saldo otomatis. pembelian paket langganan, dan unduhan file PDF sungguhan belum diimplementasikan.</w:t>
+              <w:t xml:space="preserve">Updata Requirements Traceability Matrix (Bagian 6) berdasarkan hasil regression testing tanggal 21/09/2026. Menambahkan catatan gap implementasi: fitur pencarian, kategori Populer/Gratis, pemotongan saldo otomatis. pembelian paket langganan, dan unduhan file PDF sungguhan belum diimplementasikan.</w:t>
             </w:r>
           </w:p>
         </w:tc>
@@ -396,21 +396,21 @@
               <w:rPr>
                 <w:rtl w:val="0"/>
               </w:rPr>
-              <w:t xml:space="preserve">29/09/2026</w:t>
-            </w:r>
-          </w:p>
-        </w:tc>
-        <w:tc>
-          <w:tcPr/>
-          <w:p>
-            <w:pPr>
-              <w:rPr/>
-            </w:pPr>
-            <w:r>
-              <w:rPr>
-                <w:rtl w:val="0"/>
-              </w:rPr>
-              <w:t xml:space="preserve">Pembaruan setelah regression testing 29/09/2026 beserta uji ulang perbaikan (commit d51a808): status Requirements Traceability Matrix (Bagian 6) diverifikasi; mencatat perubahan kebutuhan hasil diskusi dengan mentor (pengunjung wajib login untuk membaca majalah gratis); menambah kebutuhan non-fungsional Validasi Data (minimal top up Rp10.000) dan Responsivitas Status; mencatat fitur Ubah Password yang kini berfungsi serta Lupa Password dan pembatalan top up sebagai saran pengembangan.</w:t>
+              <w:t xml:space="preserve">30/09/2026</w:t>
+            </w:r>
+          </w:p>
+        </w:tc>
+        <w:tc>
+          <w:tcPr/>
+          <w:p>
+            <w:pPr>
+              <w:rPr/>
+            </w:pPr>
+            <w:r>
+              <w:rPr>
+                <w:rtl w:val="0"/>
+              </w:rPr>
+              <w:t xml:space="preserve">Pembaruan setelah regression testing 29/09/2026 beserta uji ulang perbaikan (commit d51a808): status Requirements Traceability Matrix (Bagian 6) diverifikasi; menambah kebutuhan non-fungsional Validasi Data (minimal top up Rp10.000) dan Responsivitas Status; mencatat fitur Ubah Password yang kini berfungsi serta Lupa Password dan pembatalan top up sebagai saran pengembangan.</w:t>
             </w:r>
           </w:p>
         </w:tc>
@@ -954,6 +954,9 @@
           <w:numId w:val="1"/>
         </w:numPr>
         <w:ind w:left="720" w:hanging="360"/>
+        <w:rPr>
+          <w:u w:val="none"/>
+        </w:rPr>
       </w:pPr>
       <w:r>
         <w:rPr>
@@ -1189,6 +1192,9 @@
           <w:numId w:val="2"/>
         </w:numPr>
         <w:ind w:left="720" w:hanging="360"/>
+        <w:rPr>
+          <w:u w:val="none"/>
+        </w:rPr>
       </w:pPr>
       <w:r>
         <w:rPr>
@@ -1208,7 +1214,7 @@
         <w:rPr>
           <w:rtl w:val="0"/>
         </w:rPr>
-        <w:t xml:space="preserve">) hanya dapat melihat katalog, detail majalah, dan pratinjau editorial. Membeli maupun membaca majalah, termasuk majalah gratis, mewajibkan login (keputusan bersama mentor, 29/09/2026).</w:t>
+        <w:t xml:space="preserve">) hanya dapat melihat katalog, detail majalah, dan pratinjau editorial. Membeli maupun membaca majalah, termasuk majalah gratis, mewajibkan login.</w:t>
       </w:r>
     </w:p>
     <w:p>
@@ -2153,40 +2159,6 @@
           </w:p>
         </w:tc>
       </w:tr>
-      <w:tr>
-        <w:trPr>
-          <w:cantSplit w:val="0"/>
-          <w:tblHeader w:val="0"/>
-        </w:trPr>
-        <w:tc>
-          <w:tcPr/>
-          <w:p>
-            <w:pPr>
-              <w:rPr/>
-            </w:pPr>
-            <w:r>
-              <w:rPr>
-                <w:rtl w:val="0"/>
-              </w:rPr>
-              <w:t xml:space="preserve">Responsivitas Status</w:t>
-            </w:r>
-          </w:p>
-        </w:tc>
-        <w:tc>
-          <w:tcPr/>
-          <w:p>
-            <w:pPr>
-              <w:rPr/>
-            </w:pPr>
-            <w:r>
-              <w:rPr>
-                <w:rtl w:val="0"/>
-              </w:rPr>
-              <w:t xml:space="preserve">Perubahan status top up oleh admin harus tampil di aplikasi (pop-up notifikasi dan status di Riwayat Top Up) paling lambat sekitar 10 detik ketika halaman Riwayat Top Up terbuka, dan sekitar 30 detik di halaman lain, tanpa pengguna perlu membuka ulang halaman.</w:t>
-            </w:r>
-          </w:p>
-        </w:tc>
-      </w:tr>
     </w:tbl>
     <w:p>
       <w:pPr>
@@ -2341,13 +2313,13 @@
         <w:tblLook w:val="0620"/>
       </w:tblPr>
       <w:tblGrid>
-        <w:gridCol w:w="1830"/>
-        <w:gridCol w:w="2505"/>
+        <w:gridCol w:w="1920"/>
+        <w:gridCol w:w="2415"/>
         <w:gridCol w:w="4665"/>
         <w:tblGridChange w:id="0">
           <w:tblGrid>
-            <w:gridCol w:w="1830"/>
-            <w:gridCol w:w="2505"/>
+            <w:gridCol w:w="1920"/>
+            <w:gridCol w:w="2415"/>
             <w:gridCol w:w="4665"/>
           </w:tblGrid>
         </w:tblGridChange>
@@ -2429,7 +2401,7 @@
               <w:rPr>
                 <w:rtl w:val="0"/>
               </w:rPr>
-              <w:t xml:space="preserve">Modul Autentikasi &amp; Profil (Login, Profil, Ubah Sandi)</w:t>
+              <w:t xml:space="preserve">Modul Autentikasi &amp; Profil (Login, Profil, Ubah Sandi) </w:t>
             </w:r>
           </w:p>
         </w:tc>
@@ -2445,27 +2417,13 @@
                 <w:bCs w:val="1"/>
                 <w:rtl w:val="0"/>
               </w:rPr>
-              <w:t xml:space="preserve">Terverifikasi Sebagian (29/09/2026). </w:t>
-            </w:r>
-            <w:r>
-              <w:rPr>
-                <w:rtl w:val="0"/>
-              </w:rPr>
-              <w:t xml:space="preserve">Register dan Sign In memakai Supabase Auth dengan perpanjangan sesi otomatis, session guard (guest/login), halaman Akun, serta Ubah Password (verifikasi password lama, minimal 8 karakter kombinasi huruf dan angka) lolos pengujian (skenario 1.1–1.7, 2.1–2.4, 3.1–3.4). Belum: SSO Google (menampilkan pesan belum tersedia) dan Lupa Password (menampilkan informasi; rencana: email reset + </w:t>
-            </w:r>
-            <w:r>
-              <w:rPr>
-                <w:i w:val="1"/>
-                <w:iCs w:val="1"/>
-                <w:rtl w:val="0"/>
-              </w:rPr>
-              <w:t xml:space="preserve">deep link</w:t>
-            </w:r>
-            <w:r>
-              <w:rPr>
-                <w:rtl w:val="0"/>
-              </w:rPr>
-              <w:t xml:space="preserve">).</w:t>
+              <w:t xml:space="preserve">Terverifikasi Sebagian (29/09/2026)</w:t>
+            </w:r>
+            <w:r>
+              <w:rPr>
+                <w:rtl w:val="0"/>
+              </w:rPr>
+              <w:t xml:space="preserve">. Register dan Sign In memakai Supabase Auth dengan perpanjangan sesi otomatis, session guard (guest/login), halaman Akun, serta Ubah Password (verifikasi password lama, minimal 8 karakter kombinasi huruf dan angka) lolos pengujian (skenario 1.1–1.7, 2.1–2.4, 3.1–3.4). Belum: SSO Google (menampilkan pesan belum tersedia) dan Lupa Password (menampilkan informasi; rencana: email reset + deep link).</w:t>
             </w:r>
           </w:p>
         </w:tc>
@@ -2485,21 +2443,21 @@
               <w:rPr>
                 <w:rtl w:val="0"/>
               </w:rPr>
-              <w:t xml:space="preserve">SRS_F_002, SRS_F_003</w:t>
-            </w:r>
-          </w:p>
-        </w:tc>
-        <w:tc>
-          <w:tcPr/>
-          <w:p>
-            <w:pPr>
-              <w:rPr/>
-            </w:pPr>
-            <w:r>
-              <w:rPr>
-                <w:rtl w:val="0"/>
-              </w:rPr>
-              <w:t xml:space="preserve">Modul Katalog &amp; Eksplorasi (Beranda, Pencarian, Detail Majalah)</w:t>
+              <w:t xml:space="preserve">SRS_F_002, SRS_F_003 </w:t>
+            </w:r>
+          </w:p>
+        </w:tc>
+        <w:tc>
+          <w:tcPr/>
+          <w:p>
+            <w:pPr>
+              <w:rPr/>
+            </w:pPr>
+            <w:r>
+              <w:rPr>
+                <w:rtl w:val="0"/>
+              </w:rPr>
+              <w:t xml:space="preserve">Modul Katalog &amp; Eksplorasi (Beranda, Pencarian, Detail Majalah) </w:t>
             </w:r>
           </w:p>
         </w:tc>
@@ -2521,7 +2479,7 @@
               <w:rPr>
                 <w:rtl w:val="0"/>
               </w:rPr>
-              <w:t xml:space="preserve">Beranda (Terbaru, Populer, Gratis), halaman Majalah (29 edisi 2020–2026, chip tahun, hero Terbaru/Terpopuler/Pilihan dengan Terpopuler berdasarkan pembeli terbanyak), Detail Majalah dengan status Beli / Baca Gratis / Baca Sekarang / Segera Tersedia lolos pengujian (skenario 4.1–4.6, 5.1–5.7, 6.1, 6.7). Pengunjung diarahkan ke Sign In untuk Beli maupun Baca Gratis. Belum: fitur pencarian.</w:t>
+              <w:t xml:space="preserve"> Beranda (Terbaru, Populer, Gratis), halaman Majalah (29 edisi 2020–2026, chip tahun, hero Terbaru/Terpopuler/Pilihan dengan Terpopuler berdasarkan pembeli terbanyak), Detail Majalah dengan status Beli / Baca Gratis / Baca Sekarang / Segera Tersedia lolos pengujian (skenario 4.1–4.6, 5.1–5.7, 6.1, 6.7). Pengunjung diarahkan ke Sign In untuk Beli maupun Baca Gratis. Belum: fitur pencarian.</w:t>
             </w:r>
           </w:p>
         </w:tc>
@@ -2541,7 +2499,7 @@
               <w:rPr>
                 <w:rtl w:val="0"/>
               </w:rPr>
-              <w:t xml:space="preserve">SRS_F_004, SRS_F_005</w:t>
+              <w:t xml:space="preserve">SRS_F_004, SRS_F_005 </w:t>
             </w:r>
           </w:p>
         </w:tc>
@@ -2569,7 +2527,7 @@
               <w:rPr>
                 <w:rtl w:val="0"/>
               </w:rPr>
-              <w:t xml:space="preserve">, Konfirmasi Pembelian)</w:t>
+              <w:t xml:space="preserve">, Konfirmasi Pembelian) </w:t>
             </w:r>
           </w:p>
         </w:tc>
@@ -2585,13 +2543,13 @@
                 <w:bCs w:val="1"/>
                 <w:rtl w:val="0"/>
               </w:rPr>
-              <w:t xml:space="preserve">Terverifikasi Sebagian (29/09/2026). </w:t>
-            </w:r>
-            <w:r>
-              <w:rPr>
-                <w:rtl w:val="0"/>
-              </w:rPr>
-              <w:t xml:space="preserve">Pembelian atomik (saldo terpotong sekali walau tombol ditekan ganda, saldo tetap saat gagal karena offline), top up BCA/QRIS dengan validasi nominal minimal, konfirmasi admin yang menambah saldo, serta Riwayat Top Up yang memperbarui status otomatis dengan jam sesuai zona waktu perangkat lolos pengujian (skenario 6.2–6.10, 7.1–7.8, 12.9). Belum: pembelian paket langganan dan pembatalan top up oleh pengguna.</w:t>
+              <w:t xml:space="preserve">Terverifikasi Sebagian (29/09/2026)</w:t>
+            </w:r>
+            <w:r>
+              <w:rPr>
+                <w:rtl w:val="0"/>
+              </w:rPr>
+              <w:t xml:space="preserve">. Pembelian atomik (saldo terpotong sekali walau tombol ditekan ganda, saldo tetap saat gagal karena offline), top up BCA/QRIS dengan validasi nominal minimal, konfirmasi admin yang menambah saldo, serta Riwayat Top Up yang memperbarui status otomatis dengan jam sesuai zona waktu perangkat lolos pengujian (skenario 6.2–6.10, 7.1–7.8, 12.9). Belum: pembelian paket langganan dan pembatalan top up oleh pengguna.</w:t>
             </w:r>
           </w:p>
         </w:tc>
@@ -2611,7 +2569,7 @@
               <w:rPr>
                 <w:rtl w:val="0"/>
               </w:rPr>
-              <w:t xml:space="preserve">SRS_F_006</w:t>
+              <w:t xml:space="preserve">SRS_F_006 </w:t>
             </w:r>
           </w:p>
         </w:tc>
@@ -2641,13 +2599,13 @@
                 <w:bCs w:val="1"/>
                 <w:rtl w:val="0"/>
               </w:rPr>
-              <w:t xml:space="preserve">Terverifikasi (29/09/2026). </w:t>
-            </w:r>
-            <w:r>
-              <w:rPr>
-                <w:rtl w:val="0"/>
-              </w:rPr>
-              <w:t xml:space="preserve">Koleksi menampilkan majalah yang dibeli atau diambil (gratis), dikelompokkan per tahun, kartu Terakhir Dibaca melanjutkan halaman terakhir, dan koleksi antar-akun terpisah (skenario 8.1–8.3, 8.6, 8.10).</w:t>
+              <w:t xml:space="preserve">Terverifikasi (29/09/2026)</w:t>
+            </w:r>
+            <w:r>
+              <w:rPr>
+                <w:rtl w:val="0"/>
+              </w:rPr>
+              <w:t xml:space="preserve">. Koleksi menampilkan majalah yang dibeli atau diambil (gratis), dikelompokkan per tahun, kartu Terakhir Dibaca melanjutkan halaman terakhir, dan koleksi antar-akun terpisah (skenario 8.1–8.3, 8.6, 8.10).</w:t>
             </w:r>
           </w:p>
         </w:tc>
@@ -2695,7 +2653,7 @@
               <w:rPr>
                 <w:rtl w:val="0"/>
               </w:rPr>
-              <w:t xml:space="preserve">)</w:t>
+              <w:t xml:space="preserve">) </w:t>
             </w:r>
           </w:p>
         </w:tc>
@@ -2711,13 +2669,13 @@
                 <w:bCs w:val="1"/>
                 <w:rtl w:val="0"/>
               </w:rPr>
-              <w:t xml:space="preserve">Terverifikasi (29/09/2026). </w:t>
-            </w:r>
-            <w:r>
-              <w:rPr>
-                <w:rtl w:val="0"/>
-              </w:rPr>
-              <w:t xml:space="preserve">Unduh dan hapus unduhan dari Koleksi maupun menu E-Reader, penanganan galat dengan pesan berbahasa Indonesia, rotasi layar, status baca (Membaca Online / Membaca Offline / Offline · Belum Diunduh), serta zoom, geser, layar penuh, dan lompat halaman lolos pengujian (skenario 8.4–8.9, 9.1–9.4, 10.1–10.5).</w:t>
+              <w:t xml:space="preserve">Terverifikasi (29/09/2026)</w:t>
+            </w:r>
+            <w:r>
+              <w:rPr>
+                <w:rtl w:val="0"/>
+              </w:rPr>
+              <w:t xml:space="preserve">. Unduh dan hapus unduhan dari Koleksi maupun menu E-Reader, penanganan galat dengan pesan berbahasa Indonesia, rotasi layar, status baca (Membaca Online / Membaca Offline / Offline · Belum Diunduh), serta zoom, geser, layar penuh, dan lompat halaman lolos pengujian (skenario 8.4–8.9, 9.1–9.4, 10.1–10.5).</w:t>
             </w:r>
           </w:p>
         </w:tc>
@@ -2767,27 +2725,13 @@
                 <w:bCs w:val="1"/>
                 <w:rtl w:val="0"/>
               </w:rPr>
-              <w:t xml:space="preserve">Terverifikasi Sebagian (29/09/2026). </w:t>
-            </w:r>
-            <w:r>
-              <w:rPr>
-                <w:rtl w:val="0"/>
-              </w:rPr>
-              <w:t xml:space="preserve">Notifikasi otomatis dari basis data tampil di halaman Notifikasi, badge lonceng, dan pop-up di dalam aplikasi; status baca tersimpan (skenario 7.4, 7.5, 7.7, 11.1–11.3). Belum: </w:t>
-            </w:r>
-            <w:r>
-              <w:rPr>
-                <w:i w:val="1"/>
-                <w:iCs w:val="1"/>
-                <w:rtl w:val="0"/>
-              </w:rPr>
-              <w:t xml:space="preserve">push notification</w:t>
-            </w:r>
-            <w:r>
-              <w:rPr>
-                <w:rtl w:val="0"/>
-              </w:rPr>
-              <w:t xml:space="preserve"> saat aplikasi ditutup (ditunda sesuai kesepakatan dengan mentor, 28/09/2026).</w:t>
+              <w:t xml:space="preserve">Terverifikasi Sebagian (29/09/2026)</w:t>
+            </w:r>
+            <w:r>
+              <w:rPr>
+                <w:rtl w:val="0"/>
+              </w:rPr>
+              <w:t xml:space="preserve">. Notifikasi otomatis dari basis data tampil di halaman Notifikasi, badge lonceng, dan pop-up di dalam aplikasi; status baca tersimpan (skenario 7.4, 7.5, 7.7, 11.1–11.3). Belum: push notification saat aplikasi ditutup (ditunda sesuai kesepakatan dengan mentor, 28/09/2026).</w:t>
             </w:r>
           </w:p>
         </w:tc>
@@ -2837,13 +2781,13 @@
                 <w:bCs w:val="1"/>
                 <w:rtl w:val="0"/>
               </w:rPr>
-              <w:t xml:space="preserve">Terverifikasi (29/09/2026). </w:t>
-            </w:r>
-            <w:r>
-              <w:rPr>
-                <w:rtl w:val="0"/>
-              </w:rPr>
-              <w:t xml:space="preserve">Halaman 1–6 dari majalah yang tersedia dimuat dari Supabase Storage; majalah yang belum tersedia menampilkan cover (skenario 6.1).</w:t>
+              <w:t xml:space="preserve">Terverifikasi (29/09/2026)</w:t>
+            </w:r>
+            <w:r>
+              <w:rPr>
+                <w:rtl w:val="0"/>
+              </w:rPr>
+              <w:t xml:space="preserve">. Halaman 1–6 dari majalah yang tersedia dimuat dari Supabase Storage; majalah yang belum tersedia menampilkan cover (skenario 6.1).</w:t>
             </w:r>
           </w:p>
         </w:tc>
@@ -2863,7 +2807,7 @@
               <w:rPr>
                 <w:rtl w:val="0"/>
               </w:rPr>
-              <w:t xml:space="preserve">NFR Security (Transaksi)</w:t>
+              <w:t xml:space="preserve">NFR Security (Transaksi) </w:t>
             </w:r>
           </w:p>
         </w:tc>
@@ -2893,13 +2837,13 @@
                 <w:bCs w:val="1"/>
                 <w:rtl w:val="0"/>
               </w:rPr>
-              <w:t xml:space="preserve">Terverifikasi (29/09/2026). </w:t>
-            </w:r>
-            <w:r>
-              <w:rPr>
-                <w:rtl w:val="0"/>
-              </w:rPr>
-              <w:t xml:space="preserve">Diuji langsung di basis data dengan menyamar sebagai pengguna: mengubah saldo sendiri, top up berstatus Berhasil, top up atas nama orang lain, pembelian langsung ke tabel, membeli majalah tanpa PDF, mengubah status top up final, mengakses notifikasi orang lain, dan top up bernominal nol, semuanya ditolak (skenario 12.1–12.7, 12.9).</w:t>
+              <w:t xml:space="preserve">Terverifikasi (29/09/2026)</w:t>
+            </w:r>
+            <w:r>
+              <w:rPr>
+                <w:rtl w:val="0"/>
+              </w:rPr>
+              <w:t xml:space="preserve">. Diuji langsung di basis data dengan menyamar sebagai pengguna: mengubah saldo sendiri, top up berstatus Berhasil, top up atas nama orang lain, pembelian langsung ke tabel, membeli majalah tanpa PDF, mengubah status top up final, mengakses notifikasi orang lain, dan top up bernominal nol, semuanya ditolak (skenario 12.1–12.7, 12.9).</w:t>
             </w:r>
           </w:p>
         </w:tc>
@@ -2945,17 +2889,9 @@
             </w:pPr>
             <w:r>
               <w:rPr>
-                <w:b w:val="1"/>
-                <w:bCs w:val="1"/>
-                <w:rtl w:val="0"/>
-              </w:rPr>
-              <w:t xml:space="preserve">Belum Terpenuhi. </w:t>
-            </w:r>
-            <w:r>
-              <w:rPr>
-                <w:rtl w:val="0"/>
-              </w:rPr>
-              <w:t xml:space="preserve">Bucket PDF masih publik sehingga file dapat diakses melalui URL langsung (skenario 12.8 gagal, sesuai perkiraan). Ditunda setelah demo (keputusan 29/09/2026). Rencana: bucket privat, policy akses berdasarkan data pembelian, dan unduhan dengan token login pengguna.</w:t>
+                <w:rtl w:val="0"/>
+              </w:rPr>
+              <w:t xml:space="preserve">Belum Terpenuhi. Transaksi dan saldo sudah dilindungi RLS dan fungsi basis data, namun bucket PDF masih publik sehingga file dapat diakses melalui URL langsung. Rencana produksi: bucket privat dengan pengecekan pembelian dan signed URL berumur pendek.</w:t>
             </w:r>
           </w:p>
         </w:tc>
@@ -2975,21 +2911,21 @@
               <w:rPr>
                 <w:rtl w:val="0"/>
               </w:rPr>
-              <w:t xml:space="preserve">NFR Availability, Validasi Data, Responsivitas Status</w:t>
-            </w:r>
-          </w:p>
-        </w:tc>
-        <w:tc>
-          <w:tcPr/>
-          <w:p>
-            <w:pPr>
-              <w:rPr/>
-            </w:pPr>
-            <w:r>
-              <w:rPr>
-                <w:rtl w:val="0"/>
-              </w:rPr>
-              <w:t xml:space="preserve">Mode Luring, Validasi Top Up, Pembaruan Status</w:t>
+              <w:t xml:space="preserve">NFR Availability, Validasi Data, Responsivitas Status </w:t>
+            </w:r>
+          </w:p>
+        </w:tc>
+        <w:tc>
+          <w:tcPr/>
+          <w:p>
+            <w:pPr>
+              <w:rPr/>
+            </w:pPr>
+            <w:r>
+              <w:rPr>
+                <w:rtl w:val="0"/>
+              </w:rPr>
+              <w:t xml:space="preserve">Mode Luring, Validasi Top Up, Pembaruan Status </w:t>
             </w:r>
           </w:p>
         </w:tc>
@@ -3011,7 +2947,7 @@
               <w:rPr>
                 <w:rtl w:val="0"/>
               </w:rPr>
-              <w:t xml:space="preserve">Aplikasi tetap terbuka saat luring dengan data tersimpan (9.1–9.4); nominal top up tidak valid ditolak aplikasi dan basis data (7.6, 12.9); status top up diperbarui otomatis ±10 detik di Riwayat Top Up (7.7).</w:t>
+              <w:t xml:space="preserve">Aplikasi tetap terbuka saat luring dengan data tersimpan (9.1–9.4); nominal top up tidak valid ditolak aplikasi dan basis data (7.6, 12.9); status top up diperbarui otomatis ±10 detik di Riwayat Top Up (7.7). </w:t>
             </w:r>
           </w:p>
         </w:tc>

</xml_diff>